<commit_message>
Deploying to gh-pages from @ Morrison-Lab/pds@4de3324816eaf57893754945e91edfbc3b0e5a70 🚀
</commit_message>
<xml_diff>
--- a/index.docx
+++ b/index.docx
@@ -7,7 +7,7 @@
         <w:pStyle w:val="Title"/>
       </w:pPr>
       <w:r>
-        <w:t xml:space="preserve">Quarto Website Template</w:t>
+        <w:t xml:space="preserve">Probability for Data Science</w:t>
       </w:r>
     </w:p>
     <w:p>
@@ -15,10 +15,10 @@
         <w:pStyle w:val="Date"/>
       </w:pPr>
       <w:r>
-        <w:t xml:space="preserve">Last modified: 2026-09-25 15:36:14 (PDT)</w:t>
+        <w:t xml:space="preserve">Last modified: 2026-09-25 16:17:06 (PDT)</w:t>
       </w:r>
     </w:p>
-    <w:bookmarkStart w:id="17" w:name="welcome"/>
+    <w:bookmarkStart w:id="10" w:name="welcome"/>
     <w:p>
       <w:pPr>
         <w:pStyle w:val="Heading1"/>
@@ -32,53 +32,24 @@
         <w:pStyle w:val="FirstParagraph"/>
       </w:pPr>
       <w:r>
-        <w:t xml:space="preserve">This is a Quarto website template that you can use to create your own website.</w:t>
+        <w:t xml:space="preserve">These notes collect the probability that data science courses assume.</w:t>
+      </w:r>
+    </w:p>
+    <w:bookmarkStart w:id="9" w:name="using-these-notes-in-another-site"/>
+    <w:p>
+      <w:pPr>
+        <w:pStyle w:val="Heading2"/>
+      </w:pPr>
+      <w:r>
+        <w:t xml:space="preserve">0.1 Using these notes in another site</w:t>
       </w:r>
     </w:p>
     <w:p>
       <w:pPr>
-        <w:pStyle w:val="BodyText"/>
-      </w:pPr>
-      <w:r>
-        <w:t xml:space="preserve">The notes are available in multiple formats:</w:t>
-      </w:r>
-    </w:p>
-    <w:p>
-      <w:pPr>
-        <w:pStyle w:val="Compact"/>
-        <w:numPr>
-          <w:ilvl w:val="0"/>
-          <w:numId w:val="1001"/>
-        </w:numPr>
-      </w:pPr>
-      <w:r>
-        <w:rPr>
-          <w:b/>
-          <w:bCs/>
-        </w:rPr>
-        <w:t xml:space="preserve">HTML Website</w:t>
-      </w:r>
-      <w:r>
-        <w:t xml:space="preserve">: Navigate using the navbar for easy access to all pages</w:t>
-      </w:r>
-    </w:p>
-    <w:p>
-      <w:pPr>
-        <w:pStyle w:val="Compact"/>
-        <w:numPr>
-          <w:ilvl w:val="0"/>
-          <w:numId w:val="1001"/>
-        </w:numPr>
-      </w:pPr>
-      <w:r>
-        <w:rPr>
-          <w:b/>
-          <w:bCs/>
-        </w:rPr>
-        <w:t xml:space="preserve">RevealJS Slides</w:t>
-      </w:r>
-      <w:r>
-        <w:t xml:space="preserve">: Each chapter can generate a presentation format with</w:t>
+        <w:pStyle w:val="FirstParagraph"/>
+      </w:pPr>
+      <w:r>
+        <w:t xml:space="preserve">Course sites include these notes as a git submodule named</w:t>
       </w:r>
       <w:r>
         <w:t xml:space="preserve"> </w:t>
@@ -87,32 +58,19 @@
         <w:rPr>
           <w:rStyle w:val="VerbatimChar"/>
         </w:rPr>
-        <w:t xml:space="preserve">-slides.html</w:t>
+        <w:t xml:space="preserve">pds</w:t>
       </w:r>
       <w:r>
         <w:t xml:space="preserve"> </w:t>
       </w:r>
       <w:r>
-        <w:t xml:space="preserve">suffix</w:t>
-      </w:r>
-    </w:p>
-    <w:p>
-      <w:pPr>
-        <w:pStyle w:val="Compact"/>
-        <w:numPr>
-          <w:ilvl w:val="0"/>
-          <w:numId w:val="1001"/>
-        </w:numPr>
-      </w:pPr>
-      <w:r>
-        <w:rPr>
-          <w:b/>
-          <w:bCs/>
-        </w:rPr>
-        <w:t xml:space="preserve">PDF Handouts</w:t>
-      </w:r>
-      <w:r>
-        <w:t xml:space="preserve">: Each chapter can generate a PDF handout with</w:t>
+        <w:t xml:space="preserve">at the site’s root,</w:t>
+      </w:r>
+      <w:r>
+        <w:t xml:space="preserve"> </w:t>
+      </w:r>
+      <w:r>
+        <w:t xml:space="preserve">and include fragments with paths that start with</w:t>
       </w:r>
       <w:r>
         <w:t xml:space="preserve"> </w:t>
@@ -121,32 +79,18 @@
         <w:rPr>
           <w:rStyle w:val="VerbatimChar"/>
         </w:rPr>
-        <w:t xml:space="preserve">-handout.pdf</w:t>
-      </w:r>
-      <w:r>
-        <w:t xml:space="preserve"> </w:t>
-      </w:r>
-      <w:r>
-        <w:t xml:space="preserve">suffix</w:t>
+        <w:t xml:space="preserve">pds/</w:t>
+      </w:r>
+      <w:r>
+        <w:t xml:space="preserve">.</w:t>
       </w:r>
     </w:p>
     <w:p>
       <w:pPr>
-        <w:pStyle w:val="Compact"/>
-        <w:numPr>
-          <w:ilvl w:val="0"/>
-          <w:numId w:val="1001"/>
-        </w:numPr>
-      </w:pPr>
-      <w:r>
-        <w:rPr>
-          <w:b/>
-          <w:bCs/>
-        </w:rPr>
-        <w:t xml:space="preserve">DOCX Documents</w:t>
-      </w:r>
-      <w:r>
-        <w:t xml:space="preserve">: Each chapter can generate a Microsoft Word document with</w:t>
+        <w:pStyle w:val="BodyText"/>
+      </w:pPr>
+      <w:r>
+        <w:t xml:space="preserve">Quarto resolves</w:t>
       </w:r>
       <w:r>
         <w:t xml:space="preserve"> </w:t>
@@ -155,453 +99,29 @@
         <w:rPr>
           <w:rStyle w:val="VerbatimChar"/>
         </w:rPr>
-        <w:t xml:space="preserve">.docx</w:t>
+        <w:t xml:space="preserve">@id</w:t>
       </w:r>
       <w:r>
         <w:t xml:space="preserve"> </w:t>
       </w:r>
       <w:r>
-        <w:t xml:space="preserve">extension</w:t>
+        <w:t xml:space="preserve">cross-references only within one rendered page,</w:t>
+      </w:r>
+      <w:r>
+        <w:t xml:space="preserve"> </w:t>
+      </w:r>
+      <w:r>
+        <w:t xml:space="preserve">so a host site that links to a result here</w:t>
+      </w:r>
+      <w:r>
+        <w:t xml:space="preserve"> </w:t>
+      </w:r>
+      <w:r>
+        <w:t xml:space="preserve">uses an explicit link to the page and anchor.</w:t>
       </w:r>
     </w:p>
-    <w:bookmarkStart w:id="10" w:name="about-this-website"/>
-    <w:p>
-      <w:pPr>
-        <w:pStyle w:val="Heading2"/>
-      </w:pPr>
-      <w:r>
-        <w:t xml:space="preserve">0.1 About this website</w:t>
-      </w:r>
-    </w:p>
-    <w:p>
-      <w:pPr>
-        <w:pStyle w:val="FirstParagraph"/>
-      </w:pPr>
-      <w:r>
-        <w:t xml:space="preserve">This website is built with</w:t>
-      </w:r>
-      <w:r>
-        <w:t xml:space="preserve"> </w:t>
-      </w:r>
-      <w:hyperlink r:id="rId9">
-        <w:r>
-          <w:rPr>
-            <w:rStyle w:val="Hyperlink"/>
-          </w:rPr>
-          <w:t xml:space="preserve">Quarto</w:t>
-        </w:r>
-      </w:hyperlink>
-      <w:r>
-        <w:t xml:space="preserve">, an open-source scientific and technical publishing system. You can use Quarto to create books, websites, blogs, presentations, and more from markdown files.</w:t>
-      </w:r>
-    </w:p>
+    <w:bookmarkEnd w:id="9"/>
     <w:bookmarkEnd w:id="10"/>
-    <w:bookmarkStart w:id="11" w:name="getting-started"/>
-    <w:p>
-      <w:pPr>
-        <w:pStyle w:val="Heading2"/>
-      </w:pPr>
-      <w:r>
-        <w:t xml:space="preserve">0.2 Getting Started</w:t>
-      </w:r>
-    </w:p>
-    <w:p>
-      <w:pPr>
-        <w:pStyle w:val="FirstParagraph"/>
-      </w:pPr>
-      <w:r>
-        <w:t xml:space="preserve">To use this template:</w:t>
-      </w:r>
-    </w:p>
-    <w:p>
-      <w:pPr>
-        <w:numPr>
-          <w:ilvl w:val="0"/>
-          <w:numId w:val="1002"/>
-        </w:numPr>
-      </w:pPr>
-      <w:r>
-        <w:rPr>
-          <w:b/>
-          <w:bCs/>
-        </w:rPr>
-        <w:t xml:space="preserve">Update the configuration</w:t>
-      </w:r>
-      <w:r>
-        <w:t xml:space="preserve">: Edit</w:t>
-      </w:r>
-      <w:r>
-        <w:t xml:space="preserve"> </w:t>
-      </w:r>
-      <w:r>
-        <w:rPr>
-          <w:rStyle w:val="VerbatimChar"/>
-        </w:rPr>
-        <w:t xml:space="preserve">_quarto-website.yml</w:t>
-      </w:r>
-      <w:r>
-        <w:t xml:space="preserve"> </w:t>
-      </w:r>
-      <w:r>
-        <w:t xml:space="preserve">to change the website title, site URL, and navigation menu.</w:t>
-      </w:r>
-    </w:p>
-    <w:p>
-      <w:pPr>
-        <w:numPr>
-          <w:ilvl w:val="0"/>
-          <w:numId w:val="1002"/>
-        </w:numPr>
-      </w:pPr>
-      <w:r>
-        <w:rPr>
-          <w:b/>
-          <w:bCs/>
-        </w:rPr>
-        <w:t xml:space="preserve">Add your content</w:t>
-      </w:r>
-      <w:r>
-        <w:t xml:space="preserve">: Create new</w:t>
-      </w:r>
-      <w:r>
-        <w:t xml:space="preserve"> </w:t>
-      </w:r>
-      <w:r>
-        <w:rPr>
-          <w:rStyle w:val="VerbatimChar"/>
-        </w:rPr>
-        <w:t xml:space="preserve">.qmd</w:t>
-      </w:r>
-      <w:r>
-        <w:t xml:space="preserve"> </w:t>
-      </w:r>
-      <w:r>
-        <w:t xml:space="preserve">files for each page and add them to the navigation menu in</w:t>
-      </w:r>
-      <w:r>
-        <w:t xml:space="preserve"> </w:t>
-      </w:r>
-      <w:r>
-        <w:rPr>
-          <w:rStyle w:val="VerbatimChar"/>
-        </w:rPr>
-        <w:t xml:space="preserve">_quarto-website.yml</w:t>
-      </w:r>
-      <w:r>
-        <w:t xml:space="preserve">.</w:t>
-      </w:r>
-    </w:p>
-    <w:p>
-      <w:pPr>
-        <w:numPr>
-          <w:ilvl w:val="0"/>
-          <w:numId w:val="1002"/>
-        </w:numPr>
-      </w:pPr>
-      <w:r>
-        <w:rPr>
-          <w:b/>
-          <w:bCs/>
-        </w:rPr>
-        <w:t xml:space="preserve">Customize the style</w:t>
-      </w:r>
-      <w:r>
-        <w:t xml:space="preserve">: Modify</w:t>
-      </w:r>
-      <w:r>
-        <w:t xml:space="preserve"> </w:t>
-      </w:r>
-      <w:r>
-        <w:rPr>
-          <w:rStyle w:val="VerbatimChar"/>
-        </w:rPr>
-        <w:t xml:space="preserve">styles.css</w:t>
-      </w:r>
-      <w:r>
-        <w:t xml:space="preserve"> </w:t>
-      </w:r>
-      <w:r>
-        <w:t xml:space="preserve">to change the appearance of your website.</w:t>
-      </w:r>
-    </w:p>
-    <w:p>
-      <w:pPr>
-        <w:numPr>
-          <w:ilvl w:val="0"/>
-          <w:numId w:val="1002"/>
-        </w:numPr>
-      </w:pPr>
-      <w:r>
-        <w:rPr>
-          <w:b/>
-          <w:bCs/>
-        </w:rPr>
-        <w:t xml:space="preserve">Add references</w:t>
-      </w:r>
-      <w:r>
-        <w:t xml:space="preserve">: Update</w:t>
-      </w:r>
-      <w:r>
-        <w:t xml:space="preserve"> </w:t>
-      </w:r>
-      <w:r>
-        <w:rPr>
-          <w:rStyle w:val="VerbatimChar"/>
-        </w:rPr>
-        <w:t xml:space="preserve">references.bib</w:t>
-      </w:r>
-      <w:r>
-        <w:t xml:space="preserve"> </w:t>
-      </w:r>
-      <w:r>
-        <w:t xml:space="preserve">with your citations.</w:t>
-      </w:r>
-    </w:p>
-    <w:bookmarkEnd w:id="11"/>
-    <w:bookmarkStart w:id="12" w:name="building-the-website"/>
-    <w:p>
-      <w:pPr>
-        <w:pStyle w:val="Heading2"/>
-      </w:pPr>
-      <w:r>
-        <w:t xml:space="preserve">0.3 Building the website</w:t>
-      </w:r>
-    </w:p>
-    <w:p>
-      <w:pPr>
-        <w:pStyle w:val="FirstParagraph"/>
-      </w:pPr>
-      <w:r>
-        <w:t xml:space="preserve">To render the website locally:</w:t>
-      </w:r>
-    </w:p>
-    <w:p>
-      <w:pPr>
-        <w:pStyle w:val="SourceCode"/>
-      </w:pPr>
-      <w:r>
-        <w:rPr>
-          <w:rStyle w:val="ExtensionTok"/>
-        </w:rPr>
-        <w:t xml:space="preserve">quarto</w:t>
-      </w:r>
-      <w:r>
-        <w:rPr>
-          <w:rStyle w:val="NormalTok"/>
-        </w:rPr>
-        <w:t xml:space="preserve"> render</w:t>
-      </w:r>
-    </w:p>
-    <w:p>
-      <w:pPr>
-        <w:pStyle w:val="FirstParagraph"/>
-      </w:pPr>
-      <w:r>
-        <w:t xml:space="preserve">To preview the website with live reload:</w:t>
-      </w:r>
-    </w:p>
-    <w:p>
-      <w:pPr>
-        <w:pStyle w:val="SourceCode"/>
-      </w:pPr>
-      <w:r>
-        <w:rPr>
-          <w:rStyle w:val="ExtensionTok"/>
-        </w:rPr>
-        <w:t xml:space="preserve">quarto</w:t>
-      </w:r>
-      <w:r>
-        <w:rPr>
-          <w:rStyle w:val="NormalTok"/>
-        </w:rPr>
-        <w:t xml:space="preserve"> preview</w:t>
-      </w:r>
-    </w:p>
-    <w:p>
-      <w:pPr>
-        <w:pStyle w:val="FirstParagraph"/>
-      </w:pPr>
-      <w:r>
-        <w:t xml:space="preserve">The rendered output will be in the</w:t>
-      </w:r>
-      <w:r>
-        <w:t xml:space="preserve"> </w:t>
-      </w:r>
-      <w:r>
-        <w:rPr>
-          <w:rStyle w:val="VerbatimChar"/>
-        </w:rPr>
-        <w:t xml:space="preserve">_site/</w:t>
-      </w:r>
-      <w:r>
-        <w:t xml:space="preserve"> </w:t>
-      </w:r>
-      <w:r>
-        <w:t xml:space="preserve">directory, which can be published to GitHub Pages.</w:t>
-      </w:r>
-    </w:p>
-    <w:bookmarkEnd w:id="12"/>
-    <w:bookmarkStart w:id="13" w:name="publishing-to-github-pages"/>
-    <w:p>
-      <w:pPr>
-        <w:pStyle w:val="Heading2"/>
-      </w:pPr>
-      <w:r>
-        <w:t xml:space="preserve">0.4 Publishing to GitHub Pages</w:t>
-      </w:r>
-    </w:p>
-    <w:p>
-      <w:pPr>
-        <w:pStyle w:val="FirstParagraph"/>
-      </w:pPr>
-      <w:r>
-        <w:t xml:space="preserve">This template includes a GitHub Actions workflow that automatically builds and publishes your website to GitHub Pages when you push to the main branch.</w:t>
-      </w:r>
-    </w:p>
-    <w:p>
-      <w:pPr>
-        <w:pStyle w:val="BodyText"/>
-      </w:pPr>
-      <w:r>
-        <w:t xml:space="preserve">To enable GitHub Pages:</w:t>
-      </w:r>
-    </w:p>
-    <w:p>
-      <w:pPr>
-        <w:pStyle w:val="Compact"/>
-        <w:numPr>
-          <w:ilvl w:val="0"/>
-          <w:numId w:val="1003"/>
-        </w:numPr>
-      </w:pPr>
-      <w:r>
-        <w:t xml:space="preserve">Go to your repository settings</w:t>
-      </w:r>
-    </w:p>
-    <w:p>
-      <w:pPr>
-        <w:pStyle w:val="Compact"/>
-        <w:numPr>
-          <w:ilvl w:val="0"/>
-          <w:numId w:val="1003"/>
-        </w:numPr>
-      </w:pPr>
-      <w:r>
-        <w:t xml:space="preserve">Navigate to</w:t>
-      </w:r>
-      <w:r>
-        <w:t xml:space="preserve"> </w:t>
-      </w:r>
-      <w:r>
-        <w:t xml:space="preserve">“Pages”</w:t>
-      </w:r>
-      <w:r>
-        <w:t xml:space="preserve"> </w:t>
-      </w:r>
-      <w:r>
-        <w:t xml:space="preserve">in the left sidebar</w:t>
-      </w:r>
-    </w:p>
-    <w:p>
-      <w:pPr>
-        <w:pStyle w:val="Compact"/>
-        <w:numPr>
-          <w:ilvl w:val="0"/>
-          <w:numId w:val="1003"/>
-        </w:numPr>
-      </w:pPr>
-      <w:r>
-        <w:t xml:space="preserve">Under</w:t>
-      </w:r>
-      <w:r>
-        <w:t xml:space="preserve"> </w:t>
-      </w:r>
-      <w:r>
-        <w:t xml:space="preserve">“Build and deployment”</w:t>
-      </w:r>
-      <w:r>
-        <w:t xml:space="preserve">, set Source to</w:t>
-      </w:r>
-      <w:r>
-        <w:t xml:space="preserve"> </w:t>
-      </w:r>
-      <w:r>
-        <w:t xml:space="preserve">“GitHub Actions”</w:t>
-      </w:r>
-    </w:p>
-    <w:p>
-      <w:pPr>
-        <w:pStyle w:val="Compact"/>
-        <w:numPr>
-          <w:ilvl w:val="0"/>
-          <w:numId w:val="1003"/>
-        </w:numPr>
-      </w:pPr>
-      <w:r>
-        <w:t xml:space="preserve">Push your changes to the main branch</w:t>
-      </w:r>
-    </w:p>
-    <w:p>
-      <w:pPr>
-        <w:pStyle w:val="Compact"/>
-        <w:numPr>
-          <w:ilvl w:val="0"/>
-          <w:numId w:val="1003"/>
-        </w:numPr>
-      </w:pPr>
-      <w:r>
-        <w:t xml:space="preserve">The workflow will automatically build and deploy your website</w:t>
-      </w:r>
-    </w:p>
-    <w:p>
-      <w:pPr>
-        <w:pStyle w:val="FirstParagraph"/>
-      </w:pPr>
-      <w:r>
-        <w:t xml:space="preserve">Your website will be available at</w:t>
-      </w:r>
-      <w:r>
-        <w:t xml:space="preserve"> </w:t>
-      </w:r>
-      <w:r>
-        <w:rPr>
-          <w:rStyle w:val="VerbatimChar"/>
-        </w:rPr>
-        <w:t xml:space="preserve">https://YOUR-USERNAME.github.io/YOUR-REPO/</w:t>
-      </w:r>
-    </w:p>
-    <w:bookmarkEnd w:id="13"/>
-    <w:bookmarkStart w:id="14" w:name="license"/>
-    <w:p>
-      <w:pPr>
-        <w:pStyle w:val="Heading2"/>
-      </w:pPr>
-      <w:r>
-        <w:t xml:space="preserve">0.5 License</w:t>
-      </w:r>
-    </w:p>
-    <w:p>
-      <w:pPr>
-        <w:pStyle w:val="FirstParagraph"/>
-      </w:pPr>
-      <w:r>
-        <w:t xml:space="preserve">Add your license information here.</w:t>
-      </w:r>
-    </w:p>
-    <w:bookmarkEnd w:id="14"/>
-    <w:bookmarkStart w:id="16" w:name="references"/>
-    <w:p>
-      <w:pPr>
-        <w:pStyle w:val="Heading2"/>
-      </w:pPr>
-      <w:r>
-        <w:t xml:space="preserve">References</w:t>
-      </w:r>
-    </w:p>
-    <w:bookmarkStart w:id="15" w:name="refs"/>
-    <w:bookmarkEnd w:id="15"/>
-    <w:bookmarkEnd w:id="16"/>
-    <w:bookmarkEnd w:id="17"/>
     <w:sectPr>
       <w:footnotePr>
         <w:numRestart w:val="eachSect"/>
@@ -712,259 +232,8 @@
       </w:pPr>
     </w:lvl>
   </w:abstractNum>
-  <w:abstractNum w:abstractNumId="991">
-    <w:nsid w:val="0000A991"/>
-    <w:multiLevelType w:val="multilevel"/>
-    <w:lvl w:ilvl="0">
-      <w:numFmt w:val="bullet"/>
-      <w:lvlText w:val=""/>
-      <w:lvlJc w:val="left"/>
-      <w:pPr>
-        <w:ind w:left="720" w:hanging="360"/>
-      </w:pPr>
-      <w:rPr>
-        <w:rFonts w:ascii="Symbol" w:hAnsi="Symbol" w:cs="Symbol" w:hint="default"/>
-      </w:rPr>
-    </w:lvl>
-    <w:lvl w:ilvl="1">
-      <w:numFmt w:val="bullet"/>
-      <w:lvlText w:val="o"/>
-      <w:lvlJc w:val="left"/>
-      <w:pPr>
-        <w:ind w:left="1440" w:hanging="360"/>
-      </w:pPr>
-      <w:rPr>
-        <w:rFonts w:ascii="Courier New" w:hAnsi="Courier New" w:cs="Courier New" w:hint="default"/>
-      </w:rPr>
-    </w:lvl>
-    <w:lvl w:ilvl="2">
-      <w:numFmt w:val="bullet"/>
-      <w:lvlText w:val=""/>
-      <w:lvlJc w:val="left"/>
-      <w:pPr>
-        <w:ind w:left="2160" w:hanging="360"/>
-      </w:pPr>
-      <w:rPr>
-        <w:rFonts w:ascii="Wingdings" w:hAnsi="Wingdings" w:cs="Wingdings" w:hint="default"/>
-      </w:rPr>
-    </w:lvl>
-    <w:lvl w:ilvl="3">
-      <w:numFmt w:val="bullet"/>
-      <w:lvlText w:val=""/>
-      <w:lvlJc w:val="left"/>
-      <w:pPr>
-        <w:ind w:left="2880" w:hanging="360"/>
-      </w:pPr>
-      <w:rPr>
-        <w:rFonts w:ascii="Symbol" w:hAnsi="Symbol" w:cs="Symbol" w:hint="default"/>
-      </w:rPr>
-    </w:lvl>
-    <w:lvl w:ilvl="4">
-      <w:numFmt w:val="bullet"/>
-      <w:lvlText w:val="o"/>
-      <w:lvlJc w:val="left"/>
-      <w:pPr>
-        <w:ind w:left="3600" w:hanging="360"/>
-      </w:pPr>
-      <w:rPr>
-        <w:rFonts w:ascii="Courier New" w:hAnsi="Courier New" w:cs="Courier New" w:hint="default"/>
-      </w:rPr>
-    </w:lvl>
-    <w:lvl w:ilvl="5">
-      <w:numFmt w:val="bullet"/>
-      <w:lvlText w:val=""/>
-      <w:lvlJc w:val="left"/>
-      <w:pPr>
-        <w:ind w:left="4320" w:hanging="360"/>
-      </w:pPr>
-      <w:rPr>
-        <w:rFonts w:ascii="Wingdings" w:hAnsi="Wingdings" w:cs="Wingdings" w:hint="default"/>
-      </w:rPr>
-    </w:lvl>
-    <w:lvl w:ilvl="6">
-      <w:numFmt w:val="bullet"/>
-      <w:lvlText w:val=""/>
-      <w:lvlJc w:val="left"/>
-      <w:pPr>
-        <w:ind w:left="5040" w:hanging="360"/>
-      </w:pPr>
-      <w:rPr>
-        <w:rFonts w:ascii="Symbol" w:hAnsi="Symbol" w:cs="Symbol" w:hint="default"/>
-      </w:rPr>
-    </w:lvl>
-    <w:lvl w:ilvl="7">
-      <w:numFmt w:val="bullet"/>
-      <w:lvlText w:val="o"/>
-      <w:lvlJc w:val="left"/>
-      <w:pPr>
-        <w:ind w:left="5760" w:hanging="360"/>
-      </w:pPr>
-      <w:rPr>
-        <w:rFonts w:ascii="Courier New" w:hAnsi="Courier New" w:cs="Courier New" w:hint="default"/>
-      </w:rPr>
-    </w:lvl>
-    <w:lvl w:ilvl="8">
-      <w:numFmt w:val="bullet"/>
-      <w:lvlText w:val=""/>
-      <w:lvlJc w:val="left"/>
-      <w:pPr>
-        <w:ind w:left="6480" w:hanging="360"/>
-      </w:pPr>
-      <w:rPr>
-        <w:rFonts w:ascii="Wingdings" w:hAnsi="Wingdings" w:cs="Wingdings" w:hint="default"/>
-      </w:rPr>
-    </w:lvl>
-  </w:abstractNum>
-  <w:abstractNum w:abstractNumId="99411">
-    <w:nsid w:val="00A99411"/>
-    <w:multiLevelType w:val="multilevel"/>
-    <w:lvl w:ilvl="0">
-      <w:start w:val="1"/>
-      <w:numFmt w:val="decimal"/>
-      <w:lvlText w:val="%1."/>
-      <w:lvlJc w:val="left"/>
-      <w:pPr>
-        <w:ind w:left="720" w:hanging="360"/>
-      </w:pPr>
-    </w:lvl>
-    <w:lvl w:ilvl="1">
-      <w:start w:val="1"/>
-      <w:numFmt w:val="decimal"/>
-      <w:lvlText w:val="%2."/>
-      <w:lvlJc w:val="left"/>
-      <w:pPr>
-        <w:ind w:left="1440" w:hanging="360"/>
-      </w:pPr>
-    </w:lvl>
-    <w:lvl w:ilvl="2">
-      <w:start w:val="1"/>
-      <w:numFmt w:val="decimal"/>
-      <w:lvlText w:val="%3."/>
-      <w:lvlJc w:val="left"/>
-      <w:pPr>
-        <w:ind w:left="2160" w:hanging="360"/>
-      </w:pPr>
-    </w:lvl>
-    <w:lvl w:ilvl="3">
-      <w:start w:val="1"/>
-      <w:numFmt w:val="decimal"/>
-      <w:lvlText w:val="%4."/>
-      <w:lvlJc w:val="left"/>
-      <w:pPr>
-        <w:ind w:left="2880" w:hanging="360"/>
-      </w:pPr>
-    </w:lvl>
-    <w:lvl w:ilvl="4">
-      <w:start w:val="1"/>
-      <w:numFmt w:val="decimal"/>
-      <w:lvlText w:val="%5."/>
-      <w:lvlJc w:val="left"/>
-      <w:pPr>
-        <w:ind w:left="3600" w:hanging="360"/>
-      </w:pPr>
-    </w:lvl>
-    <w:lvl w:ilvl="5">
-      <w:start w:val="1"/>
-      <w:numFmt w:val="decimal"/>
-      <w:lvlText w:val="%6."/>
-      <w:lvlJc w:val="left"/>
-      <w:pPr>
-        <w:ind w:left="4320" w:hanging="360"/>
-      </w:pPr>
-    </w:lvl>
-    <w:lvl w:ilvl="6">
-      <w:start w:val="1"/>
-      <w:numFmt w:val="decimal"/>
-      <w:lvlText w:val="%7."/>
-      <w:lvlJc w:val="left"/>
-      <w:pPr>
-        <w:ind w:left="5040" w:hanging="360"/>
-      </w:pPr>
-    </w:lvl>
-    <w:lvl w:ilvl="7">
-      <w:start w:val="1"/>
-      <w:numFmt w:val="decimal"/>
-      <w:lvlText w:val="%8."/>
-      <w:lvlJc w:val="left"/>
-      <w:pPr>
-        <w:ind w:left="5760" w:hanging="360"/>
-      </w:pPr>
-    </w:lvl>
-    <w:lvl w:ilvl="8">
-      <w:start w:val="1"/>
-      <w:numFmt w:val="decimal"/>
-      <w:lvlText w:val="%9."/>
-      <w:lvlJc w:val="left"/>
-      <w:pPr>
-        <w:ind w:left="6480" w:hanging="360"/>
-      </w:pPr>
-    </w:lvl>
-  </w:abstractNum>
   <w:num w:numId="1000">
     <w:abstractNumId w:val="990"/>
-  </w:num>
-  <w:num w:numId="1001">
-    <w:abstractNumId w:val="991"/>
-  </w:num>
-  <w:num w:numId="1002">
-    <w:abstractNumId w:val="99411"/>
-    <w:lvlOverride w:ilvl="0">
-      <w:startOverride w:val="1"/>
-    </w:lvlOverride>
-    <w:lvlOverride w:ilvl="1">
-      <w:startOverride w:val="1"/>
-    </w:lvlOverride>
-    <w:lvlOverride w:ilvl="2">
-      <w:startOverride w:val="1"/>
-    </w:lvlOverride>
-    <w:lvlOverride w:ilvl="3">
-      <w:startOverride w:val="1"/>
-    </w:lvlOverride>
-    <w:lvlOverride w:ilvl="4">
-      <w:startOverride w:val="1"/>
-    </w:lvlOverride>
-    <w:lvlOverride w:ilvl="5">
-      <w:startOverride w:val="1"/>
-    </w:lvlOverride>
-    <w:lvlOverride w:ilvl="6">
-      <w:startOverride w:val="1"/>
-    </w:lvlOverride>
-    <w:lvlOverride w:ilvl="7">
-      <w:startOverride w:val="1"/>
-    </w:lvlOverride>
-    <w:lvlOverride w:ilvl="8">
-      <w:startOverride w:val="1"/>
-    </w:lvlOverride>
-  </w:num>
-  <w:num w:numId="1003">
-    <w:abstractNumId w:val="99411"/>
-    <w:lvlOverride w:ilvl="0">
-      <w:startOverride w:val="1"/>
-    </w:lvlOverride>
-    <w:lvlOverride w:ilvl="1">
-      <w:startOverride w:val="1"/>
-    </w:lvlOverride>
-    <w:lvlOverride w:ilvl="2">
-      <w:startOverride w:val="1"/>
-    </w:lvlOverride>
-    <w:lvlOverride w:ilvl="3">
-      <w:startOverride w:val="1"/>
-    </w:lvlOverride>
-    <w:lvlOverride w:ilvl="4">
-      <w:startOverride w:val="1"/>
-    </w:lvlOverride>
-    <w:lvlOverride w:ilvl="5">
-      <w:startOverride w:val="1"/>
-    </w:lvlOverride>
-    <w:lvlOverride w:ilvl="6">
-      <w:startOverride w:val="1"/>
-    </w:lvlOverride>
-    <w:lvlOverride w:ilvl="7">
-      <w:startOverride w:val="1"/>
-    </w:lvlOverride>
-    <w:lvlOverride w:ilvl="8">
-      <w:startOverride w:val="1"/>
-    </w:lvlOverride>
   </w:num>
 </w:numbering>
 </file>

</xml_diff>

<commit_message>
Deploying to gh-pages from @ Morrison-Lab/pds@97cdb6f2379d3949aac48ecbc492739578a695de 🚀
</commit_message>
<xml_diff>
--- a/index.docx
+++ b/index.docx
@@ -15,13 +15,13 @@
         <w:pStyle w:val="Date"/>
       </w:pPr>
       <w:r>
-        <w:t xml:space="preserve">Last modified: 2026-09-28 01:20:14 (PDT)</w:t>
-      </w:r>
-    </w:p>
-    <w:bookmarkStart w:id="10" w:name="welcome"/>
-    <w:p>
-      <w:pPr>
-        <w:pStyle w:val="Heading1"/>
+        <w:t xml:space="preserve">Last modified: 2026-09-28 02:06:21 (PDT)</w:t>
+      </w:r>
+    </w:p>
+    <w:bookmarkStart w:id="18" w:name="welcome"/>
+    <w:p>
+      <w:pPr>
+        <w:pStyle w:val="Heading2"/>
       </w:pPr>
       <w:r>
         <w:t xml:space="preserve">Welcome</w:t>
@@ -32,16 +32,340 @@
         <w:pStyle w:val="FirstParagraph"/>
       </w:pPr>
       <w:r>
+        <w:t xml:space="preserve">Probability theory is the branch of mathematics concerned with</w:t>
+      </w:r>
+      <w:r>
+        <w:t xml:space="preserve"> </w:t>
+      </w:r>
+      <w:r>
+        <w:t xml:space="preserve">formalizing and quantifying uncertainty.</w:t>
+      </w:r>
+      <w:r>
+        <w:t xml:space="preserve"> </w:t>
+      </w:r>
+      <w:r>
+        <w:t xml:space="preserve">It is the foundation on which statistical inference is built:</w:t>
+      </w:r>
+      <w:r>
+        <w:t xml:space="preserve"> </w:t>
+      </w:r>
+      <w:r>
+        <w:t xml:space="preserve">before we can reason about what data tell us about the world,</w:t>
+      </w:r>
+      <w:r>
+        <w:t xml:space="preserve"> </w:t>
+      </w:r>
+      <w:r>
+        <w:t xml:space="preserve">we need a precise language for describing random phenomena.</w:t>
+      </w:r>
+    </w:p>
+    <w:p>
+      <w:pPr>
+        <w:pStyle w:val="BodyText"/>
+      </w:pPr>
+      <w:r>
         <w:t xml:space="preserve">These notes collect the probability that data science courses assume.</w:t>
       </w:r>
-    </w:p>
-    <w:bookmarkStart w:id="9" w:name="using-these-notes-in-another-site"/>
+      <w:r>
+        <w:t xml:space="preserve"> </w:t>
+      </w:r>
+      <w:r>
+        <w:t xml:space="preserve">Some key results are listed here, organized by topic:</w:t>
+      </w:r>
+    </w:p>
+    <w:p>
+      <w:pPr>
+        <w:pStyle w:val="Compact"/>
+        <w:numPr>
+          <w:ilvl w:val="0"/>
+          <w:numId w:val="1001"/>
+        </w:numPr>
+      </w:pPr>
+      <w:hyperlink r:id="rId9">
+        <w:r>
+          <w:rPr>
+            <w:rStyle w:val="Hyperlink"/>
+          </w:rPr>
+          <w:t xml:space="preserve">Notation</w:t>
+        </w:r>
+      </w:hyperlink>
+    </w:p>
+    <w:p>
+      <w:pPr>
+        <w:pStyle w:val="Compact"/>
+        <w:numPr>
+          <w:ilvl w:val="0"/>
+          <w:numId w:val="1001"/>
+        </w:numPr>
+      </w:pPr>
+      <w:hyperlink r:id="rId10">
+        <w:r>
+          <w:rPr>
+            <w:rStyle w:val="Hyperlink"/>
+          </w:rPr>
+          <w:t xml:space="preserve">Probability basics</w:t>
+        </w:r>
+      </w:hyperlink>
+      <w:r>
+        <w:t xml:space="preserve">:</w:t>
+      </w:r>
+      <w:r>
+        <w:t xml:space="preserve"> </w:t>
+      </w:r>
+      <w:r>
+        <w:t xml:space="preserve">sample spaces and events, probability axioms, conditional probability,</w:t>
+      </w:r>
+      <w:r>
+        <w:t xml:space="preserve"> </w:t>
+      </w:r>
+      <w:r>
+        <w:t xml:space="preserve">and Bayes’ theorem</w:t>
+      </w:r>
+    </w:p>
+    <w:p>
+      <w:pPr>
+        <w:pStyle w:val="Compact"/>
+        <w:numPr>
+          <w:ilvl w:val="0"/>
+          <w:numId w:val="1001"/>
+        </w:numPr>
+      </w:pPr>
+      <w:hyperlink r:id="rId11">
+        <w:r>
+          <w:rPr>
+            <w:rStyle w:val="Hyperlink"/>
+          </w:rPr>
+          <w:t xml:space="preserve">Random variables</w:t>
+        </w:r>
+      </w:hyperlink>
+      <w:r>
+        <w:t xml:space="preserve">:</w:t>
+      </w:r>
+      <w:r>
+        <w:t xml:space="preserve"> </w:t>
+      </w:r>
+      <w:r>
+        <w:t xml:space="preserve">PMF, PDF, CDF, quantile function,</w:t>
+      </w:r>
+      <w:r>
+        <w:t xml:space="preserve"> </w:t>
+      </w:r>
+      <w:r>
+        <w:t xml:space="preserve">and survival, hazard, and cumulative hazard functions</w:t>
+      </w:r>
+    </w:p>
+    <w:p>
+      <w:pPr>
+        <w:pStyle w:val="Compact"/>
+        <w:numPr>
+          <w:ilvl w:val="0"/>
+          <w:numId w:val="1001"/>
+        </w:numPr>
+      </w:pPr>
+      <w:hyperlink r:id="rId12">
+        <w:r>
+          <w:rPr>
+            <w:rStyle w:val="Hyperlink"/>
+          </w:rPr>
+          <w:t xml:space="preserve">Independence</w:t>
+        </w:r>
+      </w:hyperlink>
+      <w:r>
+        <w:t xml:space="preserve">:</w:t>
+      </w:r>
+      <w:r>
+        <w:t xml:space="preserve"> </w:t>
+      </w:r>
+      <w:r>
+        <w:t xml:space="preserve">independence, conditional independence, and (conditionally) IID random variables</w:t>
+      </w:r>
+    </w:p>
+    <w:p>
+      <w:pPr>
+        <w:pStyle w:val="Compact"/>
+        <w:numPr>
+          <w:ilvl w:val="0"/>
+          <w:numId w:val="1001"/>
+        </w:numPr>
+      </w:pPr>
+      <w:hyperlink r:id="rId13">
+        <w:r>
+          <w:rPr>
+            <w:rStyle w:val="Hyperlink"/>
+          </w:rPr>
+          <w:t xml:space="preserve">Expectation</w:t>
+        </w:r>
+      </w:hyperlink>
+      <w:r>
+        <w:t xml:space="preserve">:</w:t>
+      </w:r>
+      <w:r>
+        <w:t xml:space="preserve"> </w:t>
+      </w:r>
+      <w:r>
+        <w:t xml:space="preserve">expectation, LOTUS, conditional expectation, Fubini-Tonelli,</w:t>
+      </w:r>
+      <w:r>
+        <w:t xml:space="preserve"> </w:t>
+      </w:r>
+      <w:r>
+        <w:t xml:space="preserve">and the law of iterated expectations</w:t>
+      </w:r>
+    </w:p>
+    <w:p>
+      <w:pPr>
+        <w:pStyle w:val="Compact"/>
+        <w:numPr>
+          <w:ilvl w:val="0"/>
+          <w:numId w:val="1001"/>
+        </w:numPr>
+      </w:pPr>
+      <w:hyperlink r:id="rId14">
+        <w:r>
+          <w:rPr>
+            <w:rStyle w:val="Hyperlink"/>
+          </w:rPr>
+          <w:t xml:space="preserve">Variance and covariance</w:t>
+        </w:r>
+      </w:hyperlink>
+      <w:r>
+        <w:t xml:space="preserve">:</w:t>
+      </w:r>
+      <w:r>
+        <w:t xml:space="preserve"> </w:t>
+      </w:r>
+      <w:r>
+        <w:t xml:space="preserve">deviation, variance, conditional variance, homoskedasticity, and covariance</w:t>
+      </w:r>
+    </w:p>
+    <w:p>
+      <w:pPr>
+        <w:pStyle w:val="Compact"/>
+        <w:numPr>
+          <w:ilvl w:val="0"/>
+          <w:numId w:val="1001"/>
+        </w:numPr>
+      </w:pPr>
+      <w:hyperlink r:id="rId15">
+        <w:r>
+          <w:rPr>
+            <w:rStyle w:val="Hyperlink"/>
+          </w:rPr>
+          <w:t xml:space="preserve">Key distributions</w:t>
+        </w:r>
+      </w:hyperlink>
+      <w:r>
+        <w:t xml:space="preserve">:</w:t>
+      </w:r>
+      <w:r>
+        <w:t xml:space="preserve"> </w:t>
+      </w:r>
+      <w:r>
+        <w:t xml:space="preserve">Bernoulli, Poisson, negative binomial, and Weibull distributions</w:t>
+      </w:r>
+    </w:p>
+    <w:p>
+      <w:pPr>
+        <w:pStyle w:val="Compact"/>
+        <w:numPr>
+          <w:ilvl w:val="0"/>
+          <w:numId w:val="1001"/>
+        </w:numPr>
+      </w:pPr>
+      <w:hyperlink r:id="rId16">
+        <w:r>
+          <w:rPr>
+            <w:rStyle w:val="Hyperlink"/>
+          </w:rPr>
+          <w:t xml:space="preserve">Limit theorems</w:t>
+        </w:r>
+      </w:hyperlink>
+      <w:r>
+        <w:t xml:space="preserve">:</w:t>
+      </w:r>
+      <w:r>
+        <w:t xml:space="preserve"> </w:t>
+      </w:r>
+      <w:r>
+        <w:t xml:space="preserve">the Central Limit Theorem</w:t>
+      </w:r>
+    </w:p>
+    <w:p>
+      <w:pPr>
+        <w:pStyle w:val="FirstParagraph"/>
+      </w:pPr>
+      <w:r>
+        <w:t xml:space="preserve">Most of this material should be review from an introductory probability or</w:t>
+      </w:r>
+      <w:r>
+        <w:t xml:space="preserve"> </w:t>
+      </w:r>
+      <w:r>
+        <w:t xml:space="preserve">mathematical statistics course</w:t>
+      </w:r>
+      <w:r>
+        <w:t xml:space="preserve"> </w:t>
+      </w:r>
+      <w:r>
+        <w:t xml:space="preserve">(e.g., UC Davis’s Epi 202).</w:t>
+      </w:r>
+      <w:r>
+        <w:t xml:space="preserve"> </w:t>
+      </w:r>
+      <w:r>
+        <w:t xml:space="preserve">These notes began as the probability chapter of the Morrison Lab’s</w:t>
+      </w:r>
+      <w:r>
+        <w:t xml:space="preserve"> </w:t>
+      </w:r>
+      <w:hyperlink r:id="rId17">
+        <w:r>
+          <w:rPr>
+            <w:rStyle w:val="Hyperlink"/>
+            <w:i/>
+            <w:iCs/>
+          </w:rPr>
+          <w:t xml:space="preserve">Regression Models for Epidemiology</w:t>
+        </w:r>
+      </w:hyperlink>
+      <w:r>
+        <w:t xml:space="preserve">,</w:t>
+      </w:r>
+      <w:r>
+        <w:t xml:space="preserve"> </w:t>
+      </w:r>
+      <w:r>
+        <w:t xml:space="preserve">which applies them to regression and survival models</w:t>
+      </w:r>
+      <w:r>
+        <w:t xml:space="preserve"> </w:t>
+      </w:r>
+      <w:r>
+        <w:t xml:space="preserve">(see</w:t>
+      </w:r>
+      <w:r>
+        <w:t xml:space="preserve"> </w:t>
+      </w:r>
+      <w:hyperlink w:anchor="sec-additional-resources">
+        <w:r>
+          <w:rPr>
+            <w:rStyle w:val="Hyperlink"/>
+          </w:rPr>
+          <w:t xml:space="preserve">Additional resources</w:t>
+        </w:r>
+      </w:hyperlink>
+      <w:r>
+        <w:t xml:space="preserve">).</w:t>
+      </w:r>
+    </w:p>
+    <w:bookmarkEnd w:id="18"/>
+    <w:bookmarkStart w:id="19" w:name="using-these-notes-in-another-site"/>
     <w:p>
       <w:pPr>
         <w:pStyle w:val="Heading2"/>
       </w:pPr>
       <w:r>
-        <w:t xml:space="preserve">0.1 Using these notes in another site</w:t>
+        <w:t xml:space="preserve">Using these notes in another site</w:t>
       </w:r>
     </w:p>
     <w:p>
@@ -82,7 +406,52 @@
         <w:t xml:space="preserve">pds/</w:t>
       </w:r>
       <w:r>
+        <w:t xml:space="preserve">,</w:t>
+      </w:r>
+      <w:r>
+        <w:t xml:space="preserve"> </w:t>
+      </w:r>
+      <w:r>
+        <w:t xml:space="preserve">for example</w:t>
+      </w:r>
+      <w:r>
+        <w:t xml:space="preserve"> </w:t>
+      </w:r>
+      <w:r>
+        <w:rPr>
+          <w:rStyle w:val="VerbatimChar"/>
+        </w:rPr>
+        <w:t xml:space="preserve">{{&lt; include pds/_subfiles/_thm-bayes.qmd &gt;}}</w:t>
+      </w:r>
+      <w:r>
         <w:t xml:space="preserve">.</w:t>
+      </w:r>
+      <w:r>
+        <w:t xml:space="preserve"> </w:t>
+      </w:r>
+      <w:r>
+        <w:t xml:space="preserve">This site includes its own fragments the same way,</w:t>
+      </w:r>
+      <w:r>
+        <w:t xml:space="preserve"> </w:t>
+      </w:r>
+      <w:r>
+        <w:t xml:space="preserve">through a</w:t>
+      </w:r>
+      <w:r>
+        <w:t xml:space="preserve"> </w:t>
+      </w:r>
+      <w:r>
+        <w:rPr>
+          <w:rStyle w:val="VerbatimChar"/>
+        </w:rPr>
+        <w:t xml:space="preserve">pds</w:t>
+      </w:r>
+      <w:r>
+        <w:t xml:space="preserve"> </w:t>
+      </w:r>
+      <w:r>
+        <w:t xml:space="preserve">symlink that points at the repository root.</w:t>
       </w:r>
     </w:p>
     <w:p>
@@ -117,11 +486,127 @@
         <w:t xml:space="preserve"> </w:t>
       </w:r>
       <w:r>
-        <w:t xml:space="preserve">uses an explicit link to the page and anchor.</w:t>
-      </w:r>
-    </w:p>
-    <w:bookmarkEnd w:id="9"/>
-    <w:bookmarkEnd w:id="10"/>
+        <w:t xml:space="preserve">uses an explicit link,</w:t>
+      </w:r>
+      <w:r>
+        <w:t xml:space="preserve"> </w:t>
+      </w:r>
+      <w:r>
+        <w:rPr>
+          <w:rStyle w:val="VerbatimChar"/>
+        </w:rPr>
+        <w:t xml:space="preserve">[text](expectation.qmd#thm-lotus)</w:t>
+      </w:r>
+      <w:r>
+        <w:t xml:space="preserve">.</w:t>
+      </w:r>
+    </w:p>
+    <w:bookmarkEnd w:id="19"/>
+    <w:bookmarkStart w:id="20" w:name="sec-additional-resources"/>
+    <w:p>
+      <w:pPr>
+        <w:pStyle w:val="Heading2"/>
+      </w:pPr>
+      <w:r>
+        <w:t xml:space="preserve">Additional resources</w:t>
+      </w:r>
+    </w:p>
+    <w:p>
+      <w:pPr>
+        <w:pStyle w:val="Compact"/>
+        <w:numPr>
+          <w:ilvl w:val="0"/>
+          <w:numId w:val="1002"/>
+        </w:numPr>
+      </w:pPr>
+      <w:r>
+        <w:t xml:space="preserve">Miller (2017)</w:t>
+      </w:r>
+    </w:p>
+    <w:p>
+      <w:pPr>
+        <w:pStyle w:val="Compact"/>
+        <w:numPr>
+          <w:ilvl w:val="0"/>
+          <w:numId w:val="1002"/>
+        </w:numPr>
+      </w:pPr>
+      <w:r>
+        <w:t xml:space="preserve">Morrison Lab’s</w:t>
+      </w:r>
+      <w:r>
+        <w:t xml:space="preserve"> </w:t>
+      </w:r>
+      <w:hyperlink r:id="rId17">
+        <w:r>
+          <w:rPr>
+            <w:rStyle w:val="Hyperlink"/>
+            <w:i/>
+            <w:iCs/>
+          </w:rPr>
+          <w:t xml:space="preserve">Regression Models for Epidemiology</w:t>
+        </w:r>
+      </w:hyperlink>
+      <w:r>
+        <w:t xml:space="preserve">,</w:t>
+      </w:r>
+      <w:r>
+        <w:t xml:space="preserve"> </w:t>
+      </w:r>
+      <w:r>
+        <w:t xml:space="preserve">which applies this material to regression and survival analysis</w:t>
+      </w:r>
+    </w:p>
+    <w:bookmarkEnd w:id="20"/>
+    <w:bookmarkStart w:id="24" w:name="references"/>
+    <w:p>
+      <w:pPr>
+        <w:pStyle w:val="Heading2"/>
+      </w:pPr>
+      <w:r>
+        <w:t xml:space="preserve">References</w:t>
+      </w:r>
+    </w:p>
+    <w:bookmarkStart w:id="23" w:name="refs"/>
+    <w:bookmarkStart w:id="22" w:name="ref-problifesaver"/>
+    <w:p>
+      <w:pPr>
+        <w:pStyle w:val="Bibliography"/>
+      </w:pPr>
+      <w:r>
+        <w:t xml:space="preserve">Miller, Steven J. 2017.</w:t>
+      </w:r>
+      <w:r>
+        <w:t xml:space="preserve"> </w:t>
+      </w:r>
+      <w:r>
+        <w:rPr>
+          <w:i/>
+          <w:iCs/>
+        </w:rPr>
+        <w:t xml:space="preserve">The Probability Lifesaver: All the Tools You Need to Understand Chance</w:t>
+      </w:r>
+      <w:r>
+        <w:t xml:space="preserve">. A Princeton Lifesaver Study Guide. Princeton University Press.</w:t>
+      </w:r>
+      <w:r>
+        <w:t xml:space="preserve"> </w:t>
+      </w:r>
+      <w:hyperlink r:id="rId21">
+        <w:r>
+          <w:rPr>
+            <w:rStyle w:val="Hyperlink"/>
+          </w:rPr>
+          <w:t xml:space="preserve">https://doi.org/10.1515/9781400885381</w:t>
+        </w:r>
+      </w:hyperlink>
+      <w:r>
+        <w:t xml:space="preserve">.</w:t>
+      </w:r>
+    </w:p>
+    <w:bookmarkEnd w:id="22"/>
+    <w:bookmarkEnd w:id="23"/>
+    <w:bookmarkEnd w:id="24"/>
     <w:sectPr>
       <w:footnotePr>
         <w:numRestart w:val="eachSect"/>
@@ -232,8 +717,117 @@
       </w:pPr>
     </w:lvl>
   </w:abstractNum>
+  <w:abstractNum w:abstractNumId="991">
+    <w:nsid w:val="0000A991"/>
+    <w:multiLevelType w:val="multilevel"/>
+    <w:lvl w:ilvl="0">
+      <w:numFmt w:val="bullet"/>
+      <w:lvlText w:val=""/>
+      <w:lvlJc w:val="left"/>
+      <w:pPr>
+        <w:ind w:left="720" w:hanging="360"/>
+      </w:pPr>
+      <w:rPr>
+        <w:rFonts w:ascii="Symbol" w:hAnsi="Symbol" w:cs="Symbol" w:hint="default"/>
+      </w:rPr>
+    </w:lvl>
+    <w:lvl w:ilvl="1">
+      <w:numFmt w:val="bullet"/>
+      <w:lvlText w:val="o"/>
+      <w:lvlJc w:val="left"/>
+      <w:pPr>
+        <w:ind w:left="1440" w:hanging="360"/>
+      </w:pPr>
+      <w:rPr>
+        <w:rFonts w:ascii="Courier New" w:hAnsi="Courier New" w:cs="Courier New" w:hint="default"/>
+      </w:rPr>
+    </w:lvl>
+    <w:lvl w:ilvl="2">
+      <w:numFmt w:val="bullet"/>
+      <w:lvlText w:val=""/>
+      <w:lvlJc w:val="left"/>
+      <w:pPr>
+        <w:ind w:left="2160" w:hanging="360"/>
+      </w:pPr>
+      <w:rPr>
+        <w:rFonts w:ascii="Wingdings" w:hAnsi="Wingdings" w:cs="Wingdings" w:hint="default"/>
+      </w:rPr>
+    </w:lvl>
+    <w:lvl w:ilvl="3">
+      <w:numFmt w:val="bullet"/>
+      <w:lvlText w:val=""/>
+      <w:lvlJc w:val="left"/>
+      <w:pPr>
+        <w:ind w:left="2880" w:hanging="360"/>
+      </w:pPr>
+      <w:rPr>
+        <w:rFonts w:ascii="Symbol" w:hAnsi="Symbol" w:cs="Symbol" w:hint="default"/>
+      </w:rPr>
+    </w:lvl>
+    <w:lvl w:ilvl="4">
+      <w:numFmt w:val="bullet"/>
+      <w:lvlText w:val="o"/>
+      <w:lvlJc w:val="left"/>
+      <w:pPr>
+        <w:ind w:left="3600" w:hanging="360"/>
+      </w:pPr>
+      <w:rPr>
+        <w:rFonts w:ascii="Courier New" w:hAnsi="Courier New" w:cs="Courier New" w:hint="default"/>
+      </w:rPr>
+    </w:lvl>
+    <w:lvl w:ilvl="5">
+      <w:numFmt w:val="bullet"/>
+      <w:lvlText w:val=""/>
+      <w:lvlJc w:val="left"/>
+      <w:pPr>
+        <w:ind w:left="4320" w:hanging="360"/>
+      </w:pPr>
+      <w:rPr>
+        <w:rFonts w:ascii="Wingdings" w:hAnsi="Wingdings" w:cs="Wingdings" w:hint="default"/>
+      </w:rPr>
+    </w:lvl>
+    <w:lvl w:ilvl="6">
+      <w:numFmt w:val="bullet"/>
+      <w:lvlText w:val=""/>
+      <w:lvlJc w:val="left"/>
+      <w:pPr>
+        <w:ind w:left="5040" w:hanging="360"/>
+      </w:pPr>
+      <w:rPr>
+        <w:rFonts w:ascii="Symbol" w:hAnsi="Symbol" w:cs="Symbol" w:hint="default"/>
+      </w:rPr>
+    </w:lvl>
+    <w:lvl w:ilvl="7">
+      <w:numFmt w:val="bullet"/>
+      <w:lvlText w:val="o"/>
+      <w:lvlJc w:val="left"/>
+      <w:pPr>
+        <w:ind w:left="5760" w:hanging="360"/>
+      </w:pPr>
+      <w:rPr>
+        <w:rFonts w:ascii="Courier New" w:hAnsi="Courier New" w:cs="Courier New" w:hint="default"/>
+      </w:rPr>
+    </w:lvl>
+    <w:lvl w:ilvl="8">
+      <w:numFmt w:val="bullet"/>
+      <w:lvlText w:val=""/>
+      <w:lvlJc w:val="left"/>
+      <w:pPr>
+        <w:ind w:left="6480" w:hanging="360"/>
+      </w:pPr>
+      <w:rPr>
+        <w:rFonts w:ascii="Wingdings" w:hAnsi="Wingdings" w:cs="Wingdings" w:hint="default"/>
+      </w:rPr>
+    </w:lvl>
+  </w:abstractNum>
   <w:num w:numId="1000">
     <w:abstractNumId w:val="990"/>
+  </w:num>
+  <w:num w:numId="1001">
+    <w:abstractNumId w:val="991"/>
+  </w:num>
+  <w:num w:numId="1002">
+    <w:abstractNumId w:val="991"/>
   </w:num>
 </w:numbering>
 </file>

</xml_diff>

<commit_message>
Deploying to gh-pages from @ Morrison-Lab/pds@b5411eb72afb0742c85b583c115fe909ba31c8c5 🚀
</commit_message>
<xml_diff>
--- a/index.docx
+++ b/index.docx
@@ -15,7 +15,7 @@
         <w:pStyle w:val="Date"/>
       </w:pPr>
       <w:r>
-        <w:t xml:space="preserve">Last modified: 2026-10-05 00:35:29 (PDT)</w:t>
+        <w:t xml:space="preserve">Last modified: 2026-10-05 00:37:24 (PDT)</w:t>
       </w:r>
     </w:p>
     <w:bookmarkStart w:id="18" w:name="welcome"/>
@@ -373,7 +373,19 @@
         <w:pStyle w:val="FirstParagraph"/>
       </w:pPr>
       <w:r>
-        <w:t xml:space="preserve">Course sites include these notes as a git submodule named</w:t>
+        <w:t xml:space="preserve">Course sites link to these pages by URL;</w:t>
+      </w:r>
+      <w:r>
+        <w:t xml:space="preserve"> </w:t>
+      </w:r>
+      <w:r>
+        <w:t xml:space="preserve">they do not include this repository as a git submodule.</w:t>
+      </w:r>
+      <w:r>
+        <w:t xml:space="preserve"> </w:t>
+      </w:r>
+      <w:r>
+        <w:t xml:space="preserve">A host site that keeps a copy of this repository at its root, named</w:t>
       </w:r>
       <w:r>
         <w:t xml:space="preserve"> </w:t>
@@ -385,16 +397,13 @@
         <w:t xml:space="preserve">pds</w:t>
       </w:r>
       <w:r>
-        <w:t xml:space="preserve"> </w:t>
-      </w:r>
-      <w:r>
-        <w:t xml:space="preserve">at the site’s root,</w:t>
-      </w:r>
-      <w:r>
-        <w:t xml:space="preserve"> </w:t>
-      </w:r>
-      <w:r>
-        <w:t xml:space="preserve">and include fragments with paths that start with</w:t>
+        <w:t xml:space="preserve">,</w:t>
+      </w:r>
+      <w:r>
+        <w:t xml:space="preserve"> </w:t>
+      </w:r>
+      <w:r>
+        <w:t xml:space="preserve">can still include fragments with paths that start with</w:t>
       </w:r>
       <w:r>
         <w:t xml:space="preserve"> </w:t>

</xml_diff>

<commit_message>
Deploying to gh-pages from @ Morrison-Lab/pds@91fa5807364464252e5ed6f1b51314e382091140 🚀
</commit_message>
<xml_diff>
--- a/index.docx
+++ b/index.docx
@@ -15,7 +15,7 @@
         <w:pStyle w:val="Date"/>
       </w:pPr>
       <w:r>
-        <w:t xml:space="preserve">Last modified: 2026-10-05 00:37:24 (PDT)</w:t>
+        <w:t xml:space="preserve">Last modified: 2026-10-05 00:35:48 (PDT)</w:t>
       </w:r>
     </w:p>
     <w:bookmarkStart w:id="18" w:name="welcome"/>
@@ -373,19 +373,7 @@
         <w:pStyle w:val="FirstParagraph"/>
       </w:pPr>
       <w:r>
-        <w:t xml:space="preserve">Course sites link to these pages by URL;</w:t>
-      </w:r>
-      <w:r>
-        <w:t xml:space="preserve"> </w:t>
-      </w:r>
-      <w:r>
-        <w:t xml:space="preserve">they do not include this repository as a git submodule.</w:t>
-      </w:r>
-      <w:r>
-        <w:t xml:space="preserve"> </w:t>
-      </w:r>
-      <w:r>
-        <w:t xml:space="preserve">A host site that keeps a copy of this repository at its root, named</w:t>
+        <w:t xml:space="preserve">Course sites include these notes as a git submodule named</w:t>
       </w:r>
       <w:r>
         <w:t xml:space="preserve"> </w:t>
@@ -397,13 +385,16 @@
         <w:t xml:space="preserve">pds</w:t>
       </w:r>
       <w:r>
-        <w:t xml:space="preserve">,</w:t>
-      </w:r>
-      <w:r>
-        <w:t xml:space="preserve"> </w:t>
-      </w:r>
-      <w:r>
-        <w:t xml:space="preserve">can still include fragments with paths that start with</w:t>
+        <w:t xml:space="preserve"> </w:t>
+      </w:r>
+      <w:r>
+        <w:t xml:space="preserve">at the site’s root,</w:t>
+      </w:r>
+      <w:r>
+        <w:t xml:space="preserve"> </w:t>
+      </w:r>
+      <w:r>
+        <w:t xml:space="preserve">and include fragments with paths that start with</w:t>
       </w:r>
       <w:r>
         <w:t xml:space="preserve"> </w:t>

</xml_diff>

<commit_message>
Deploying to gh-pages from @ Morrison-Lab/pds@bea643a0577aa71e457bf8b2cb5506271e0ef935 🚀
</commit_message>
<xml_diff>
--- a/index.docx
+++ b/index.docx
@@ -15,7 +15,7 @@
         <w:pStyle w:val="Date"/>
       </w:pPr>
       <w:r>
-        <w:t xml:space="preserve">Last modified: 2026-10-05 00:35:48 (PDT)</w:t>
+        <w:t xml:space="preserve">Last modified: 2026-10-05 00:37:01 (PDT)</w:t>
       </w:r>
     </w:p>
     <w:bookmarkStart w:id="18" w:name="welcome"/>
@@ -373,7 +373,19 @@
         <w:pStyle w:val="FirstParagraph"/>
       </w:pPr>
       <w:r>
-        <w:t xml:space="preserve">Course sites include these notes as a git submodule named</w:t>
+        <w:t xml:space="preserve">Course sites link to these pages by URL;</w:t>
+      </w:r>
+      <w:r>
+        <w:t xml:space="preserve"> </w:t>
+      </w:r>
+      <w:r>
+        <w:t xml:space="preserve">they do not include this repository as a git submodule.</w:t>
+      </w:r>
+      <w:r>
+        <w:t xml:space="preserve"> </w:t>
+      </w:r>
+      <w:r>
+        <w:t xml:space="preserve">A host site that keeps a copy of this repository at its root, named</w:t>
       </w:r>
       <w:r>
         <w:t xml:space="preserve"> </w:t>
@@ -385,16 +397,13 @@
         <w:t xml:space="preserve">pds</w:t>
       </w:r>
       <w:r>
-        <w:t xml:space="preserve"> </w:t>
-      </w:r>
-      <w:r>
-        <w:t xml:space="preserve">at the site’s root,</w:t>
-      </w:r>
-      <w:r>
-        <w:t xml:space="preserve"> </w:t>
-      </w:r>
-      <w:r>
-        <w:t xml:space="preserve">and include fragments with paths that start with</w:t>
+        <w:t xml:space="preserve">,</w:t>
+      </w:r>
+      <w:r>
+        <w:t xml:space="preserve"> </w:t>
+      </w:r>
+      <w:r>
+        <w:t xml:space="preserve">can still include fragments with paths that start with</w:t>
       </w:r>
       <w:r>
         <w:t xml:space="preserve"> </w:t>

</xml_diff>

<commit_message>
Deploying to gh-pages from @ Morrison-Lab/pds@8b4ecdbaae20fa2f2f28e3f5eb1bd0f08ffd25d1 🚀
</commit_message>
<xml_diff>
--- a/index.docx
+++ b/index.docx
@@ -15,7 +15,7 @@
         <w:pStyle w:val="Date"/>
       </w:pPr>
       <w:r>
-        <w:t xml:space="preserve">Last modified: 2026-10-06 11:12:46 (PDT)</w:t>
+        <w:t xml:space="preserve">Last modified: 2026-10-06 11:33:20 (PDT)</w:t>
       </w:r>
     </w:p>
     <w:bookmarkStart w:id="18" w:name="welcome"/>
@@ -511,13 +511,30 @@
       </w:r>
     </w:p>
     <w:bookmarkEnd w:id="19"/>
-    <w:bookmarkStart w:id="20" w:name="sec-additional-resources"/>
+    <w:bookmarkStart w:id="31" w:name="sec-additional-resources"/>
     <w:p>
       <w:pPr>
         <w:pStyle w:val="Heading2"/>
       </w:pPr>
       <w:r>
         <w:t xml:space="preserve">Additional resources</w:t>
+      </w:r>
+    </w:p>
+    <w:bookmarkStart w:id="29" w:name="comparable-courses"/>
+    <w:p>
+      <w:pPr>
+        <w:pStyle w:val="Heading3"/>
+      </w:pPr>
+      <w:r>
+        <w:t xml:space="preserve">Comparable courses</w:t>
+      </w:r>
+    </w:p>
+    <w:p>
+      <w:pPr>
+        <w:pStyle w:val="FirstParagraph"/>
+      </w:pPr>
+      <w:r>
+        <w:t xml:space="preserve">Several universities offer open-access courses with comparable or complementary coverage of probability for data science, computer science, and statistics:</w:t>
       </w:r>
     </w:p>
     <w:p>
@@ -529,7 +546,33 @@
         </w:numPr>
       </w:pPr>
       <w:r>
-        <w:t xml:space="preserve">Miller (2017)</w:t>
+        <w:rPr>
+          <w:b/>
+          <w:bCs/>
+        </w:rPr>
+        <w:t xml:space="preserve">Stanford University CS 109</w:t>
+      </w:r>
+      <w:r>
+        <w:t xml:space="preserve">:</w:t>
+      </w:r>
+      <w:r>
+        <w:t xml:space="preserve"> </w:t>
+      </w:r>
+      <w:hyperlink r:id="rId20">
+        <w:r>
+          <w:rPr>
+            <w:rStyle w:val="Hyperlink"/>
+            <w:i/>
+            <w:iCs/>
+          </w:rPr>
+          <w:t xml:space="preserve">Probability for Computer Scientists</w:t>
+        </w:r>
+      </w:hyperlink>
+      <w:r>
+        <w:t xml:space="preserve"> </w:t>
+      </w:r>
+      <w:r>
+        <w:t xml:space="preserve">(Chris Piech, Mehran Sahami, and David Varodayan) introduces counting, probability axioms, random variables, joint distributions, limit theorems, and machine learning applications.</w:t>
       </w:r>
     </w:p>
     <w:p>
@@ -538,6 +581,308 @@
         <w:numPr>
           <w:ilvl w:val="0"/>
           <w:numId w:val="1002"/>
+        </w:numPr>
+      </w:pPr>
+      <w:r>
+        <w:rPr>
+          <w:b/>
+          <w:bCs/>
+        </w:rPr>
+        <w:t xml:space="preserve">Stanford University STATS 116</w:t>
+      </w:r>
+      <w:r>
+        <w:t xml:space="preserve">:</w:t>
+      </w:r>
+      <w:r>
+        <w:t xml:space="preserve"> </w:t>
+      </w:r>
+      <w:hyperlink r:id="rId21">
+        <w:r>
+          <w:rPr>
+            <w:rStyle w:val="Hyperlink"/>
+            <w:i/>
+            <w:iCs/>
+          </w:rPr>
+          <w:t xml:space="preserve">Theory of Probability</w:t>
+        </w:r>
+      </w:hyperlink>
+      <w:r>
+        <w:t xml:space="preserve"> </w:t>
+      </w:r>
+      <w:r>
+        <w:t xml:space="preserve">(John Duchi) provides a rigorous mathematical treatment of probability spaces, conditioning, random variables, transform methods, and limit theorems (see also</w:t>
+      </w:r>
+      <w:r>
+        <w:t xml:space="preserve"> </w:t>
+      </w:r>
+      <w:hyperlink r:id="rId22">
+        <w:r>
+          <w:rPr>
+            <w:rStyle w:val="Hyperlink"/>
+          </w:rPr>
+          <w:t xml:space="preserve">lecture notes</w:t>
+        </w:r>
+      </w:hyperlink>
+      <w:r>
+        <w:t xml:space="preserve"> </w:t>
+      </w:r>
+      <w:r>
+        <w:t xml:space="preserve">by Amir Dembo).</w:t>
+      </w:r>
+    </w:p>
+    <w:p>
+      <w:pPr>
+        <w:pStyle w:val="Compact"/>
+        <w:numPr>
+          <w:ilvl w:val="0"/>
+          <w:numId w:val="1002"/>
+        </w:numPr>
+      </w:pPr>
+      <w:r>
+        <w:rPr>
+          <w:b/>
+          <w:bCs/>
+        </w:rPr>
+        <w:t xml:space="preserve">UC Berkeley Data 140 / Stat 140</w:t>
+      </w:r>
+      <w:r>
+        <w:t xml:space="preserve">:</w:t>
+      </w:r>
+      <w:r>
+        <w:t xml:space="preserve"> </w:t>
+      </w:r>
+      <w:hyperlink r:id="rId23">
+        <w:r>
+          <w:rPr>
+            <w:rStyle w:val="Hyperlink"/>
+            <w:i/>
+            <w:iCs/>
+          </w:rPr>
+          <w:t xml:space="preserve">Probability for Data Science</w:t>
+        </w:r>
+      </w:hyperlink>
+      <w:r>
+        <w:t xml:space="preserve"> </w:t>
+      </w:r>
+      <w:r>
+        <w:t xml:space="preserve">(Ani Adhikari and Jim Pitman) blends mathematical probability theory with Python simulations and computational data science applications.</w:t>
+      </w:r>
+    </w:p>
+    <w:p>
+      <w:pPr>
+        <w:pStyle w:val="Compact"/>
+        <w:numPr>
+          <w:ilvl w:val="0"/>
+          <w:numId w:val="1002"/>
+        </w:numPr>
+      </w:pPr>
+      <w:r>
+        <w:rPr>
+          <w:b/>
+          <w:bCs/>
+        </w:rPr>
+        <w:t xml:space="preserve">Harvard University Stat 110</w:t>
+      </w:r>
+      <w:r>
+        <w:t xml:space="preserve">:</w:t>
+      </w:r>
+      <w:r>
+        <w:t xml:space="preserve"> </w:t>
+      </w:r>
+      <w:hyperlink r:id="rId24">
+        <w:r>
+          <w:rPr>
+            <w:rStyle w:val="Hyperlink"/>
+            <w:i/>
+            <w:iCs/>
+          </w:rPr>
+          <w:t xml:space="preserve">Introduction to Probability</w:t>
+        </w:r>
+      </w:hyperlink>
+      <w:r>
+        <w:t xml:space="preserve"> </w:t>
+      </w:r>
+      <w:r>
+        <w:t xml:space="preserve">(Joseph K. Blitzstein; companion textbook</w:t>
+      </w:r>
+      <w:r>
+        <w:t xml:space="preserve"> </w:t>
+      </w:r>
+      <w:r>
+        <w:t xml:space="preserve">Blitzstein and Hwang (2019)</w:t>
+      </w:r>
+      <w:r>
+        <w:t xml:space="preserve">, online at</w:t>
+      </w:r>
+      <w:r>
+        <w:t xml:space="preserve"> </w:t>
+      </w:r>
+      <w:hyperlink r:id="rId25">
+        <w:r>
+          <w:rPr>
+            <w:rStyle w:val="Hyperlink"/>
+          </w:rPr>
+          <w:t xml:space="preserve">probabilitybook.net</w:t>
+        </w:r>
+      </w:hyperlink>
+      <w:r>
+        <w:t xml:space="preserve">) covers conditioning, distributions, transform methods, and Markov chains with an emphasis on intuitive storytelling.</w:t>
+      </w:r>
+    </w:p>
+    <w:p>
+      <w:pPr>
+        <w:pStyle w:val="Compact"/>
+        <w:numPr>
+          <w:ilvl w:val="0"/>
+          <w:numId w:val="1002"/>
+        </w:numPr>
+      </w:pPr>
+      <w:r>
+        <w:rPr>
+          <w:b/>
+          <w:bCs/>
+        </w:rPr>
+        <w:t xml:space="preserve">MIT 18.05</w:t>
+      </w:r>
+      <w:r>
+        <w:t xml:space="preserve">:</w:t>
+      </w:r>
+      <w:r>
+        <w:t xml:space="preserve"> </w:t>
+      </w:r>
+      <w:hyperlink r:id="rId26">
+        <w:r>
+          <w:rPr>
+            <w:rStyle w:val="Hyperlink"/>
+            <w:i/>
+            <w:iCs/>
+          </w:rPr>
+          <w:t xml:space="preserve">Introduction to Probability and Statistics</w:t>
+        </w:r>
+      </w:hyperlink>
+      <w:r>
+        <w:t xml:space="preserve"> </w:t>
+      </w:r>
+      <w:r>
+        <w:t xml:space="preserve">(Jeremy Orloff and Jonathan Bloom, MIT OpenCourseWare) bridges probability, discrete and continuous random variables, and both Bayesian and frequentist statistical inference.</w:t>
+      </w:r>
+    </w:p>
+    <w:p>
+      <w:pPr>
+        <w:pStyle w:val="Compact"/>
+        <w:numPr>
+          <w:ilvl w:val="0"/>
+          <w:numId w:val="1002"/>
+        </w:numPr>
+      </w:pPr>
+      <w:r>
+        <w:rPr>
+          <w:b/>
+          <w:bCs/>
+        </w:rPr>
+        <w:t xml:space="preserve">MIT 6.041 / 6.431</w:t>
+      </w:r>
+      <w:r>
+        <w:t xml:space="preserve">:</w:t>
+      </w:r>
+      <w:r>
+        <w:t xml:space="preserve"> </w:t>
+      </w:r>
+      <w:hyperlink r:id="rId27">
+        <w:r>
+          <w:rPr>
+            <w:rStyle w:val="Hyperlink"/>
+            <w:i/>
+            <w:iCs/>
+          </w:rPr>
+          <w:t xml:space="preserve">Probabilistic Systems Analysis and Applied Probability</w:t>
+        </w:r>
+      </w:hyperlink>
+      <w:r>
+        <w:t xml:space="preserve"> </w:t>
+      </w:r>
+      <w:r>
+        <w:t xml:space="preserve">(John Tsitsiklis, MIT OpenCourseWare) covers probability spaces, conditioning, independence, transform methods, and Bernoulli and Poisson processes.</w:t>
+      </w:r>
+    </w:p>
+    <w:p>
+      <w:pPr>
+        <w:pStyle w:val="Compact"/>
+        <w:numPr>
+          <w:ilvl w:val="0"/>
+          <w:numId w:val="1002"/>
+        </w:numPr>
+      </w:pPr>
+      <w:r>
+        <w:rPr>
+          <w:b/>
+          <w:bCs/>
+        </w:rPr>
+        <w:t xml:space="preserve">Cal Poly / Kevin Ross</w:t>
+      </w:r>
+      <w:r>
+        <w:t xml:space="preserve">:</w:t>
+      </w:r>
+      <w:r>
+        <w:t xml:space="preserve"> </w:t>
+      </w:r>
+      <w:hyperlink r:id="rId28">
+        <w:r>
+          <w:rPr>
+            <w:rStyle w:val="Hyperlink"/>
+            <w:i/>
+            <w:iCs/>
+          </w:rPr>
+          <w:t xml:space="preserve">Probability and Simulation with Applications in R</w:t>
+        </w:r>
+      </w:hyperlink>
+      <w:r>
+        <w:t xml:space="preserve"> </w:t>
+      </w:r>
+      <w:r>
+        <w:t xml:space="preserve">(Kevin Ross) emphasizes simulation, conditioning, joint distributions, and expectation using R.</w:t>
+      </w:r>
+    </w:p>
+    <w:bookmarkEnd w:id="29"/>
+    <w:bookmarkStart w:id="30" w:name="textbooks-and-companion-notes"/>
+    <w:p>
+      <w:pPr>
+        <w:pStyle w:val="Heading3"/>
+      </w:pPr>
+      <w:r>
+        <w:t xml:space="preserve">Textbooks and companion notes</w:t>
+      </w:r>
+    </w:p>
+    <w:p>
+      <w:pPr>
+        <w:pStyle w:val="Compact"/>
+        <w:numPr>
+          <w:ilvl w:val="0"/>
+          <w:numId w:val="1003"/>
+        </w:numPr>
+      </w:pPr>
+      <w:r>
+        <w:t xml:space="preserve">Miller (2017)</w:t>
+      </w:r>
+    </w:p>
+    <w:p>
+      <w:pPr>
+        <w:pStyle w:val="Compact"/>
+        <w:numPr>
+          <w:ilvl w:val="0"/>
+          <w:numId w:val="1003"/>
+        </w:numPr>
+      </w:pPr>
+      <w:r>
+        <w:t xml:space="preserve">Blitzstein and Hwang (2019)</w:t>
+      </w:r>
+    </w:p>
+    <w:p>
+      <w:pPr>
+        <w:pStyle w:val="Compact"/>
+        <w:numPr>
+          <w:ilvl w:val="0"/>
+          <w:numId w:val="1003"/>
         </w:numPr>
       </w:pPr>
       <w:r>
@@ -566,8 +911,9 @@
         <w:t xml:space="preserve">which applies this material to regression and survival analysis</w:t>
       </w:r>
     </w:p>
-    <w:bookmarkEnd w:id="20"/>
-    <w:bookmarkStart w:id="24" w:name="references"/>
+    <w:bookmarkEnd w:id="30"/>
+    <w:bookmarkEnd w:id="31"/>
+    <w:bookmarkStart w:id="37" w:name="references"/>
     <w:p>
       <w:pPr>
         <w:pStyle w:val="Heading2"/>
@@ -576,8 +922,45 @@
         <w:t xml:space="preserve">References</w:t>
       </w:r>
     </w:p>
-    <w:bookmarkStart w:id="23" w:name="refs"/>
-    <w:bookmarkStart w:id="22" w:name="ref-problifesaver"/>
+    <w:bookmarkStart w:id="36" w:name="refs"/>
+    <w:bookmarkStart w:id="33" w:name="ref-blitzstein2019introduction"/>
+    <w:p>
+      <w:pPr>
+        <w:pStyle w:val="Bibliography"/>
+      </w:pPr>
+      <w:r>
+        <w:t xml:space="preserve">Blitzstein, Joseph K, and Jessica Hwang. 2019.</w:t>
+      </w:r>
+      <w:r>
+        <w:t xml:space="preserve"> </w:t>
+      </w:r>
+      <w:r>
+        <w:rPr>
+          <w:i/>
+          <w:iCs/>
+        </w:rPr>
+        <w:t xml:space="preserve">Introduction to Probability</w:t>
+      </w:r>
+      <w:r>
+        <w:t xml:space="preserve">. 2nd ed. Chapman; Hall/CRC.</w:t>
+      </w:r>
+      <w:r>
+        <w:t xml:space="preserve"> </w:t>
+      </w:r>
+      <w:hyperlink r:id="rId32">
+        <w:r>
+          <w:rPr>
+            <w:rStyle w:val="Hyperlink"/>
+          </w:rPr>
+          <w:t xml:space="preserve">https://doi.org/10.1201/9780429428357</w:t>
+        </w:r>
+      </w:hyperlink>
+      <w:r>
+        <w:t xml:space="preserve">.</w:t>
+      </w:r>
+    </w:p>
+    <w:bookmarkEnd w:id="33"/>
+    <w:bookmarkStart w:id="35" w:name="ref-problifesaver"/>
     <w:p>
       <w:pPr>
         <w:pStyle w:val="Bibliography"/>
@@ -601,7 +984,7 @@
       <w:r>
         <w:t xml:space="preserve"> </w:t>
       </w:r>
-      <w:hyperlink r:id="rId21">
+      <w:hyperlink r:id="rId34">
         <w:r>
           <w:rPr>
             <w:rStyle w:val="Hyperlink"/>
@@ -613,9 +996,9 @@
         <w:t xml:space="preserve">.</w:t>
       </w:r>
     </w:p>
-    <w:bookmarkEnd w:id="22"/>
-    <w:bookmarkEnd w:id="23"/>
-    <w:bookmarkEnd w:id="24"/>
+    <w:bookmarkEnd w:id="35"/>
+    <w:bookmarkEnd w:id="36"/>
+    <w:bookmarkEnd w:id="37"/>
     <w:sectPr>
       <w:footnotePr>
         <w:numRestart w:val="eachSect"/>
@@ -836,6 +1219,9 @@
     <w:abstractNumId w:val="991"/>
   </w:num>
   <w:num w:numId="1002">
+    <w:abstractNumId w:val="991"/>
+  </w:num>
+  <w:num w:numId="1003">
     <w:abstractNumId w:val="991"/>
   </w:num>
 </w:numbering>

</xml_diff>

<commit_message>
Deploying to gh-pages from @ Morrison-Lab/pds@2235397d32fb9feb3ce38081e7c58be5e1994681 🚀
</commit_message>
<xml_diff>
--- a/index.docx
+++ b/index.docx
@@ -15,7 +15,7 @@
         <w:pStyle w:val="Date"/>
       </w:pPr>
       <w:r>
-        <w:t xml:space="preserve">Last modified: 2026-10-06 11:43:10 (PDT)</w:t>
+        <w:t xml:space="preserve">Last modified: 2026-10-06 14:53:51 (PDT)</w:t>
       </w:r>
     </w:p>
     <w:bookmarkStart w:id="18" w:name="welcome"/>
@@ -833,14 +833,44 @@
             <w:i/>
             <w:iCs/>
           </w:rPr>
-          <w:t xml:space="preserve">Probability and Simulation with Applications in R</w:t>
+          <w:t xml:space="preserve">An Introduction to Probability and Simulation</w:t>
         </w:r>
       </w:hyperlink>
       <w:r>
         <w:t xml:space="preserve"> </w:t>
       </w:r>
       <w:r>
-        <w:t xml:space="preserve">(Kevin Ross) emphasizes simulation, conditioning, joint distributions, and expectation using R.</w:t>
+        <w:t xml:space="preserve">(</w:t>
+      </w:r>
+      <w:r>
+        <w:t xml:space="preserve">Ross (2022)</w:t>
+      </w:r>
+      <w:r>
+        <w:t xml:space="preserve">) develops probability concepts through simulation in R and Python, providing intuitive frameworks including conditioning as</w:t>
+      </w:r>
+      <w:r>
+        <w:t xml:space="preserve"> </w:t>
+      </w:r>
+      <w:r>
+        <w:t xml:space="preserve">“slicing and renormalizing”</w:t>
+      </w:r>
+      <w:r>
+        <w:t xml:space="preserve"> </w:t>
+      </w:r>
+      <w:r>
+        <w:t xml:space="preserve">and</w:t>
+      </w:r>
+      <w:r>
+        <w:t xml:space="preserve"> </w:t>
+      </w:r>
+      <w:r>
+        <w:t xml:space="preserve">“taking out what is known”</w:t>
+      </w:r>
+      <w:r>
+        <w:t xml:space="preserve"> </w:t>
+      </w:r>
+      <w:r>
+        <w:t xml:space="preserve">in conditional expectation.</w:t>
       </w:r>
     </w:p>
     <w:bookmarkEnd w:id="29"/>
@@ -875,6 +905,43 @@
       </w:pPr>
       <w:r>
         <w:t xml:space="preserve">Blitzstein and Hwang (2019)</w:t>
+      </w:r>
+    </w:p>
+    <w:p>
+      <w:pPr>
+        <w:pStyle w:val="Compact"/>
+        <w:numPr>
+          <w:ilvl w:val="0"/>
+          <w:numId w:val="1003"/>
+        </w:numPr>
+      </w:pPr>
+      <w:r>
+        <w:t xml:space="preserve">Amir Dembo and Kevin Ross,</w:t>
+      </w:r>
+      <w:r>
+        <w:t xml:space="preserve"> </w:t>
+      </w:r>
+      <w:hyperlink r:id="rId22">
+        <w:r>
+          <w:rPr>
+            <w:rStyle w:val="Hyperlink"/>
+            <w:i/>
+            <w:iCs/>
+          </w:rPr>
+          <w:t xml:space="preserve">Stochastic Processes</w:t>
+        </w:r>
+      </w:hyperlink>
+      <w:r>
+        <w:t xml:space="preserve"> </w:t>
+      </w:r>
+      <w:r>
+        <w:t xml:space="preserve">lecture notes (</w:t>
+      </w:r>
+      <w:r>
+        <w:t xml:space="preserve">Dembo and Ross (2021)</w:t>
+      </w:r>
+      <w:r>
+        <w:t xml:space="preserve">, Stanford MATH 136 / STAT 219)</w:t>
       </w:r>
     </w:p>
     <w:p>
@@ -913,7 +980,7 @@
     </w:p>
     <w:bookmarkEnd w:id="30"/>
     <w:bookmarkEnd w:id="31"/>
-    <w:bookmarkStart w:id="37" w:name="references"/>
+    <w:bookmarkStart w:id="39" w:name="references"/>
     <w:p>
       <w:pPr>
         <w:pStyle w:val="Heading2"/>
@@ -922,7 +989,7 @@
         <w:t xml:space="preserve">References</w:t>
       </w:r>
     </w:p>
-    <w:bookmarkStart w:id="36" w:name="refs"/>
+    <w:bookmarkStart w:id="38" w:name="refs"/>
     <w:bookmarkStart w:id="33" w:name="ref-blitzstein2019introduction"/>
     <w:p>
       <w:pPr>
@@ -960,7 +1027,44 @@
       </w:r>
     </w:p>
     <w:bookmarkEnd w:id="33"/>
-    <w:bookmarkStart w:id="35" w:name="ref-problifesaver"/>
+    <w:bookmarkStart w:id="34" w:name="ref-dembo-notes"/>
+    <w:p>
+      <w:pPr>
+        <w:pStyle w:val="Bibliography"/>
+      </w:pPr>
+      <w:r>
+        <w:t xml:space="preserve">Dembo, Amir, and Kevin Ross. 2021.</w:t>
+      </w:r>
+      <w:r>
+        <w:t xml:space="preserve"> </w:t>
+      </w:r>
+      <w:r>
+        <w:rPr>
+          <w:i/>
+          <w:iCs/>
+        </w:rPr>
+        <w:t xml:space="preserve">Stochastic Processes</w:t>
+      </w:r>
+      <w:r>
+        <w:t xml:space="preserve">. Stanford University.</w:t>
+      </w:r>
+      <w:r>
+        <w:t xml:space="preserve"> </w:t>
+      </w:r>
+      <w:hyperlink r:id="rId22">
+        <w:r>
+          <w:rPr>
+            <w:rStyle w:val="Hyperlink"/>
+          </w:rPr>
+          <w:t xml:space="preserve">https://adembo.su.domains/math-136/nnotes.pdf</w:t>
+        </w:r>
+      </w:hyperlink>
+      <w:r>
+        <w:t xml:space="preserve">.</w:t>
+      </w:r>
+    </w:p>
+    <w:bookmarkEnd w:id="34"/>
+    <w:bookmarkStart w:id="36" w:name="ref-problifesaver"/>
     <w:p>
       <w:pPr>
         <w:pStyle w:val="Bibliography"/>
@@ -984,7 +1088,7 @@
       <w:r>
         <w:t xml:space="preserve"> </w:t>
       </w:r>
-      <w:hyperlink r:id="rId34">
+      <w:hyperlink r:id="rId35">
         <w:r>
           <w:rPr>
             <w:rStyle w:val="Hyperlink"/>
@@ -996,9 +1100,46 @@
         <w:t xml:space="preserve">.</w:t>
       </w:r>
     </w:p>
-    <w:bookmarkEnd w:id="35"/>
     <w:bookmarkEnd w:id="36"/>
+    <w:bookmarkStart w:id="37" w:name="ref-ross-probsim"/>
+    <w:p>
+      <w:pPr>
+        <w:pStyle w:val="Bibliography"/>
+      </w:pPr>
+      <w:r>
+        <w:t xml:space="preserve">Ross, Kevin. 2022.</w:t>
+      </w:r>
+      <w:r>
+        <w:t xml:space="preserve"> </w:t>
+      </w:r>
+      <w:r>
+        <w:rPr>
+          <w:i/>
+          <w:iCs/>
+        </w:rPr>
+        <w:t xml:space="preserve">An Introduction to Probability and Simulation</w:t>
+      </w:r>
+      <w:r>
+        <w:t xml:space="preserve">. Bookdown.</w:t>
+      </w:r>
+      <w:r>
+        <w:t xml:space="preserve"> </w:t>
+      </w:r>
+      <w:hyperlink r:id="rId28">
+        <w:r>
+          <w:rPr>
+            <w:rStyle w:val="Hyperlink"/>
+          </w:rPr>
+          <w:t xml:space="preserve">https://bookdown.org/kevin_davisross/probsim-book/</w:t>
+        </w:r>
+      </w:hyperlink>
+      <w:r>
+        <w:t xml:space="preserve">.</w:t>
+      </w:r>
+    </w:p>
     <w:bookmarkEnd w:id="37"/>
+    <w:bookmarkEnd w:id="38"/>
+    <w:bookmarkEnd w:id="39"/>
     <w:sectPr>
       <w:footnotePr>
         <w:numRestart w:val="eachSect"/>

</xml_diff>

<commit_message>
Deploying to gh-pages from @ Morrison-Lab/pds@0a4b134559cd503ee4749fbcff4b9ed78173b2e0 🚀
</commit_message>
<xml_diff>
--- a/index.docx
+++ b/index.docx
@@ -15,7 +15,7 @@
         <w:pStyle w:val="Date"/>
       </w:pPr>
       <w:r>
-        <w:t xml:space="preserve">Last modified: 2026-10-06 14:53:51 (PDT)</w:t>
+        <w:t xml:space="preserve">Last modified: 2026-10-06 15:10:50 (PDT)</w:t>
       </w:r>
     </w:p>
     <w:bookmarkStart w:id="18" w:name="welcome"/>
@@ -916,6 +916,30 @@
         </w:numPr>
       </w:pPr>
       <w:r>
+        <w:t xml:space="preserve">Hastie et al. (2009)</w:t>
+      </w:r>
+    </w:p>
+    <w:p>
+      <w:pPr>
+        <w:pStyle w:val="Compact"/>
+        <w:numPr>
+          <w:ilvl w:val="0"/>
+          <w:numId w:val="1003"/>
+        </w:numPr>
+      </w:pPr>
+      <w:r>
+        <w:t xml:space="preserve">James et al. (2021)</w:t>
+      </w:r>
+    </w:p>
+    <w:p>
+      <w:pPr>
+        <w:pStyle w:val="Compact"/>
+        <w:numPr>
+          <w:ilvl w:val="0"/>
+          <w:numId w:val="1003"/>
+        </w:numPr>
+      </w:pPr>
+      <w:r>
         <w:t xml:space="preserve">Amir Dembo and Kevin Ross,</w:t>
       </w:r>
       <w:r>
@@ -980,7 +1004,7 @@
     </w:p>
     <w:bookmarkEnd w:id="30"/>
     <w:bookmarkEnd w:id="31"/>
-    <w:bookmarkStart w:id="39" w:name="references"/>
+    <w:bookmarkStart w:id="43" w:name="references"/>
     <w:p>
       <w:pPr>
         <w:pStyle w:val="Heading2"/>
@@ -989,7 +1013,7 @@
         <w:t xml:space="preserve">References</w:t>
       </w:r>
     </w:p>
-    <w:bookmarkStart w:id="38" w:name="refs"/>
+    <w:bookmarkStart w:id="42" w:name="refs"/>
     <w:bookmarkStart w:id="33" w:name="ref-blitzstein2019introduction"/>
     <w:p>
       <w:pPr>
@@ -1064,7 +1088,95 @@
       </w:r>
     </w:p>
     <w:bookmarkEnd w:id="34"/>
-    <w:bookmarkStart w:id="36" w:name="ref-problifesaver"/>
+    <w:bookmarkStart w:id="36" w:name="ref-hastie2009elements"/>
+    <w:p>
+      <w:pPr>
+        <w:pStyle w:val="Bibliography"/>
+      </w:pPr>
+      <w:r>
+        <w:t xml:space="preserve">Hastie, Trevor, Robert Tibshirani, and Jerome Friedman. 2009.</w:t>
+      </w:r>
+      <w:r>
+        <w:t xml:space="preserve"> </w:t>
+      </w:r>
+      <w:r>
+        <w:rPr>
+          <w:i/>
+          <w:iCs/>
+        </w:rPr>
+        <w:t xml:space="preserve">The Elements of Statistical Learning: Data Mining, Inference, and Prediction</w:t>
+      </w:r>
+      <w:r>
+        <w:t xml:space="preserve">. 2nd ed. Springer.</w:t>
+      </w:r>
+      <w:r>
+        <w:t xml:space="preserve"> </w:t>
+      </w:r>
+      <w:hyperlink r:id="rId35">
+        <w:r>
+          <w:rPr>
+            <w:rStyle w:val="Hyperlink"/>
+          </w:rPr>
+          <w:t xml:space="preserve">https://doi.org/10.1007/978-0-387-84858-7</w:t>
+        </w:r>
+      </w:hyperlink>
+      <w:r>
+        <w:t xml:space="preserve">.</w:t>
+      </w:r>
+    </w:p>
+    <w:bookmarkEnd w:id="36"/>
+    <w:bookmarkStart w:id="38" w:name="ref-james2021islr2e"/>
+    <w:p>
+      <w:pPr>
+        <w:pStyle w:val="Bibliography"/>
+      </w:pPr>
+      <w:r>
+        <w:t xml:space="preserve">James, Gareth, Daniela Witten, Trevor Hastie, and Robert Tibshirani. 2021.</w:t>
+      </w:r>
+      <w:r>
+        <w:t xml:space="preserve"> </w:t>
+      </w:r>
+      <w:r>
+        <w:rPr>
+          <w:i/>
+          <w:iCs/>
+        </w:rPr>
+        <w:t xml:space="preserve">An Introduction to Statistical Learning: With Applications in</w:t>
+      </w:r>
+      <w:r>
+        <w:rPr>
+          <w:i/>
+          <w:iCs/>
+        </w:rPr>
+        <w:t xml:space="preserve"> </w:t>
+      </w:r>
+      <w:r>
+        <w:rPr>
+          <w:i/>
+          <w:iCs/>
+        </w:rPr>
+        <w:t xml:space="preserve">R</w:t>
+      </w:r>
+      <w:r>
+        <w:t xml:space="preserve">. 2nd ed. Springer.</w:t>
+      </w:r>
+      <w:r>
+        <w:t xml:space="preserve"> </w:t>
+      </w:r>
+      <w:hyperlink r:id="rId37">
+        <w:r>
+          <w:rPr>
+            <w:rStyle w:val="Hyperlink"/>
+          </w:rPr>
+          <w:t xml:space="preserve">https://doi.org/10.1007/978-1-0716-1418-1</w:t>
+        </w:r>
+      </w:hyperlink>
+      <w:r>
+        <w:t xml:space="preserve">.</w:t>
+      </w:r>
+    </w:p>
+    <w:bookmarkEnd w:id="38"/>
+    <w:bookmarkStart w:id="40" w:name="ref-problifesaver"/>
     <w:p>
       <w:pPr>
         <w:pStyle w:val="Bibliography"/>
@@ -1088,7 +1200,7 @@
       <w:r>
         <w:t xml:space="preserve"> </w:t>
       </w:r>
-      <w:hyperlink r:id="rId35">
+      <w:hyperlink r:id="rId39">
         <w:r>
           <w:rPr>
             <w:rStyle w:val="Hyperlink"/>
@@ -1100,8 +1212,8 @@
         <w:t xml:space="preserve">.</w:t>
       </w:r>
     </w:p>
-    <w:bookmarkEnd w:id="36"/>
-    <w:bookmarkStart w:id="37" w:name="ref-ross-probsim"/>
+    <w:bookmarkEnd w:id="40"/>
+    <w:bookmarkStart w:id="41" w:name="ref-ross-probsim"/>
     <w:p>
       <w:pPr>
         <w:pStyle w:val="Bibliography"/>
@@ -1137,9 +1249,9 @@
         <w:t xml:space="preserve">.</w:t>
       </w:r>
     </w:p>
-    <w:bookmarkEnd w:id="37"/>
-    <w:bookmarkEnd w:id="38"/>
-    <w:bookmarkEnd w:id="39"/>
+    <w:bookmarkEnd w:id="41"/>
+    <w:bookmarkEnd w:id="42"/>
+    <w:bookmarkEnd w:id="43"/>
     <w:sectPr>
       <w:footnotePr>
         <w:numRestart w:val="eachSect"/>

</xml_diff>

<commit_message>
Deploying to gh-pages from @ Morrison-Lab/pds@2c8c996436f9a02db7faf42474bde9dfc52779bc 🚀
</commit_message>
<xml_diff>
--- a/index.docx
+++ b/index.docx
@@ -15,7 +15,7 @@
         <w:pStyle w:val="Date"/>
       </w:pPr>
       <w:r>
-        <w:t xml:space="preserve">Last modified: 2026-10-09 23:52:29 (PDT)</w:t>
+        <w:t xml:space="preserve">Last modified: 2026-10-10 00:00:40 (PDT)</w:t>
       </w:r>
     </w:p>
     <w:bookmarkStart w:id="18" w:name="welcome"/>
@@ -511,7 +511,7 @@
       </w:r>
     </w:p>
     <w:bookmarkEnd w:id="19"/>
-    <w:bookmarkStart w:id="31" w:name="sec-additional-resources"/>
+    <w:bookmarkStart w:id="33" w:name="sec-additional-resources"/>
     <w:p>
       <w:pPr>
         <w:pStyle w:val="Heading2"/>
@@ -1003,8 +1003,46 @@
       </w:r>
     </w:p>
     <w:bookmarkEnd w:id="30"/>
-    <w:bookmarkEnd w:id="31"/>
-    <w:bookmarkStart w:id="43" w:name="references"/>
+    <w:bookmarkStart w:id="32" w:name="video-channels"/>
+    <w:p>
+      <w:pPr>
+        <w:pStyle w:val="Heading3"/>
+      </w:pPr>
+      <w:r>
+        <w:t xml:space="preserve">Video channels</w:t>
+      </w:r>
+    </w:p>
+    <w:p>
+      <w:pPr>
+        <w:pStyle w:val="FirstParagraph"/>
+      </w:pPr>
+      <w:r>
+        <w:t xml:space="preserve">The DATA 571 (Machine Learning) course notes keep a curated list of</w:t>
+      </w:r>
+      <w:r>
+        <w:t xml:space="preserve"> </w:t>
+      </w:r>
+      <w:hyperlink r:id="rId31">
+        <w:r>
+          <w:rPr>
+            <w:rStyle w:val="Hyperlink"/>
+          </w:rPr>
+          <w:t xml:space="preserve">online video channels</w:t>
+        </w:r>
+      </w:hyperlink>
+      <w:r>
+        <w:t xml:space="preserve">,</w:t>
+      </w:r>
+      <w:r>
+        <w:t xml:space="preserve"> </w:t>
+      </w:r>
+      <w:r>
+        <w:t xml:space="preserve">with levels, for probability and statistics as well as machine learning, AI, computer science and mathematics.</w:t>
+      </w:r>
+    </w:p>
+    <w:bookmarkEnd w:id="32"/>
+    <w:bookmarkEnd w:id="33"/>
+    <w:bookmarkStart w:id="45" w:name="references"/>
     <w:p>
       <w:pPr>
         <w:pStyle w:val="Heading2"/>
@@ -1013,8 +1051,8 @@
         <w:t xml:space="preserve">References</w:t>
       </w:r>
     </w:p>
-    <w:bookmarkStart w:id="42" w:name="refs"/>
-    <w:bookmarkStart w:id="33" w:name="ref-blitzstein2019introduction"/>
+    <w:bookmarkStart w:id="44" w:name="refs"/>
+    <w:bookmarkStart w:id="35" w:name="ref-blitzstein2019introduction"/>
     <w:p>
       <w:pPr>
         <w:pStyle w:val="Bibliography"/>
@@ -1038,7 +1076,7 @@
       <w:r>
         <w:t xml:space="preserve"> </w:t>
       </w:r>
-      <w:hyperlink r:id="rId32">
+      <w:hyperlink r:id="rId34">
         <w:r>
           <w:rPr>
             <w:rStyle w:val="Hyperlink"/>
@@ -1050,8 +1088,8 @@
         <w:t xml:space="preserve">.</w:t>
       </w:r>
     </w:p>
-    <w:bookmarkEnd w:id="33"/>
-    <w:bookmarkStart w:id="34" w:name="ref-dembo-notes"/>
+    <w:bookmarkEnd w:id="35"/>
+    <w:bookmarkStart w:id="36" w:name="ref-dembo-notes"/>
     <w:p>
       <w:pPr>
         <w:pStyle w:val="Bibliography"/>
@@ -1087,8 +1125,8 @@
         <w:t xml:space="preserve">.</w:t>
       </w:r>
     </w:p>
-    <w:bookmarkEnd w:id="34"/>
-    <w:bookmarkStart w:id="36" w:name="ref-hastie2009elements"/>
+    <w:bookmarkEnd w:id="36"/>
+    <w:bookmarkStart w:id="38" w:name="ref-hastie2009elements"/>
     <w:p>
       <w:pPr>
         <w:pStyle w:val="Bibliography"/>
@@ -1112,7 +1150,7 @@
       <w:r>
         <w:t xml:space="preserve"> </w:t>
       </w:r>
-      <w:hyperlink r:id="rId35">
+      <w:hyperlink r:id="rId37">
         <w:r>
           <w:rPr>
             <w:rStyle w:val="Hyperlink"/>
@@ -1124,8 +1162,8 @@
         <w:t xml:space="preserve">.</w:t>
       </w:r>
     </w:p>
-    <w:bookmarkEnd w:id="36"/>
-    <w:bookmarkStart w:id="38" w:name="ref-james2021islr2e"/>
+    <w:bookmarkEnd w:id="38"/>
+    <w:bookmarkStart w:id="40" w:name="ref-james2021islr2e"/>
     <w:p>
       <w:pPr>
         <w:pStyle w:val="Bibliography"/>
@@ -1163,7 +1201,7 @@
       <w:r>
         <w:t xml:space="preserve"> </w:t>
       </w:r>
-      <w:hyperlink r:id="rId37">
+      <w:hyperlink r:id="rId39">
         <w:r>
           <w:rPr>
             <w:rStyle w:val="Hyperlink"/>
@@ -1175,8 +1213,8 @@
         <w:t xml:space="preserve">.</w:t>
       </w:r>
     </w:p>
-    <w:bookmarkEnd w:id="38"/>
-    <w:bookmarkStart w:id="40" w:name="ref-problifesaver"/>
+    <w:bookmarkEnd w:id="40"/>
+    <w:bookmarkStart w:id="42" w:name="ref-problifesaver"/>
     <w:p>
       <w:pPr>
         <w:pStyle w:val="Bibliography"/>
@@ -1200,7 +1238,7 @@
       <w:r>
         <w:t xml:space="preserve"> </w:t>
       </w:r>
-      <w:hyperlink r:id="rId39">
+      <w:hyperlink r:id="rId41">
         <w:r>
           <w:rPr>
             <w:rStyle w:val="Hyperlink"/>
@@ -1212,8 +1250,8 @@
         <w:t xml:space="preserve">.</w:t>
       </w:r>
     </w:p>
-    <w:bookmarkEnd w:id="40"/>
-    <w:bookmarkStart w:id="41" w:name="ref-ross-probsim"/>
+    <w:bookmarkEnd w:id="42"/>
+    <w:bookmarkStart w:id="43" w:name="ref-ross-probsim"/>
     <w:p>
       <w:pPr>
         <w:pStyle w:val="Bibliography"/>
@@ -1249,9 +1287,9 @@
         <w:t xml:space="preserve">.</w:t>
       </w:r>
     </w:p>
-    <w:bookmarkEnd w:id="41"/>
-    <w:bookmarkEnd w:id="42"/>
     <w:bookmarkEnd w:id="43"/>
+    <w:bookmarkEnd w:id="44"/>
+    <w:bookmarkEnd w:id="45"/>
     <w:sectPr>
       <w:footnotePr>
         <w:numRestart w:val="eachSect"/>

</xml_diff>

<commit_message>
Deploying to gh-pages from @ Morrison-Lab/pds@b6a1ea990b85ecf9ad2e0249734761431c1cb08f 🚀
</commit_message>
<xml_diff>
--- a/index.docx
+++ b/index.docx
@@ -15,7 +15,7 @@
         <w:pStyle w:val="Date"/>
       </w:pPr>
       <w:r>
-        <w:t xml:space="preserve">Last modified: 2026-10-13 00:51:13 (PDT)</w:t>
+        <w:t xml:space="preserve">Last modified: 2026-10-13 14:27:07 (PDT)</w:t>
       </w:r>
     </w:p>
     <w:bookmarkStart w:id="18" w:name="welcome"/>
@@ -511,7 +511,7 @@
       </w:r>
     </w:p>
     <w:bookmarkEnd w:id="19"/>
-    <w:bookmarkStart w:id="33" w:name="sec-additional-resources"/>
+    <w:bookmarkStart w:id="37" w:name="sec-additional-resources"/>
     <w:p>
       <w:pPr>
         <w:pStyle w:val="Heading2"/>
@@ -520,7 +520,7 @@
         <w:t xml:space="preserve">Additional resources</w:t>
       </w:r>
     </w:p>
-    <w:bookmarkStart w:id="29" w:name="comparable-courses"/>
+    <w:bookmarkStart w:id="33" w:name="comparable-courses"/>
     <w:p>
       <w:pPr>
         <w:pStyle w:val="Heading3"/>
@@ -681,7 +681,7 @@
           <w:b/>
           <w:bCs/>
         </w:rPr>
-        <w:t xml:space="preserve">Harvard University Stat 110</w:t>
+        <w:t xml:space="preserve">Stanford University EE 278</w:t>
       </w:r>
       <w:r>
         <w:t xml:space="preserve">:</w:t>
@@ -696,23 +696,14 @@
             <w:i/>
             <w:iCs/>
           </w:rPr>
-          <w:t xml:space="preserve">Introduction to Probability</w:t>
-        </w:r>
-      </w:hyperlink>
-      <w:r>
-        <w:t xml:space="preserve"> </w:t>
-      </w:r>
-      <w:r>
-        <w:t xml:space="preserve">(Joseph K. Blitzstein; companion textbook</w:t>
-      </w:r>
-      <w:r>
-        <w:t xml:space="preserve"> </w:t>
-      </w:r>
-      <w:r>
-        <w:t xml:space="preserve">Blitzstein and Hwang (2019)</w:t>
-      </w:r>
-      <w:r>
-        <w:t xml:space="preserve">, online at</w:t>
+          <w:t xml:space="preserve">Probability and Statistical Inference</w:t>
+        </w:r>
+      </w:hyperlink>
+      <w:r>
+        <w:t xml:space="preserve"> </w:t>
+      </w:r>
+      <w:r>
+        <w:t xml:space="preserve">(Ayfer Özgür and Tsachy Weissman) builds on probability for hypothesis testing, empirical risk minimization, concentration inequalities (Markov, Chebyshev, Hoeffding), Gaussian random vectors and minimum mean-square error estimation; its</w:t>
       </w:r>
       <w:r>
         <w:t xml:space="preserve"> </w:t>
@@ -722,11 +713,45 @@
           <w:rPr>
             <w:rStyle w:val="Hyperlink"/>
           </w:rPr>
-          <w:t xml:space="preserve">probabilitybook.net</w:t>
-        </w:r>
-      </w:hyperlink>
-      <w:r>
-        <w:t xml:space="preserve">) covers conditioning, distributions, transform methods, and Markov chains with an emphasis on intuitive storytelling.</w:t>
+          <w:t xml:space="preserve">previous notes</w:t>
+        </w:r>
+      </w:hyperlink>
+      <w:r>
+        <w:t xml:space="preserve"> </w:t>
+      </w:r>
+      <w:r>
+        <w:t xml:space="preserve">are handwritten lectures on these topics. The prerequisite probability course has open lecture notes by</w:t>
+      </w:r>
+      <w:r>
+        <w:t xml:space="preserve"> </w:t>
+      </w:r>
+      <w:hyperlink r:id="rId26">
+        <w:r>
+          <w:rPr>
+            <w:rStyle w:val="Hyperlink"/>
+          </w:rPr>
+          <w:t xml:space="preserve">David Tse</w:t>
+        </w:r>
+      </w:hyperlink>
+      <w:r>
+        <w:t xml:space="preserve"> </w:t>
+      </w:r>
+      <w:r>
+        <w:t xml:space="preserve">and</w:t>
+      </w:r>
+      <w:r>
+        <w:t xml:space="preserve"> </w:t>
+      </w:r>
+      <w:hyperlink r:id="rId27">
+        <w:r>
+          <w:rPr>
+            <w:rStyle w:val="Hyperlink"/>
+          </w:rPr>
+          <w:t xml:space="preserve">Abbas El Gamal</w:t>
+        </w:r>
+      </w:hyperlink>
+      <w:r>
+        <w:t xml:space="preserve">.</w:t>
       </w:r>
     </w:p>
     <w:p>
@@ -742,7 +767,7 @@
           <w:b/>
           <w:bCs/>
         </w:rPr>
-        <w:t xml:space="preserve">MIT 18.05</w:t>
+        <w:t xml:space="preserve">Harvard University Stat 110</w:t>
       </w:r>
       <w:r>
         <w:t xml:space="preserve">:</w:t>
@@ -750,21 +775,44 @@
       <w:r>
         <w:t xml:space="preserve"> </w:t>
       </w:r>
-      <w:hyperlink r:id="rId26">
+      <w:hyperlink r:id="rId28">
         <w:r>
           <w:rPr>
             <w:rStyle w:val="Hyperlink"/>
             <w:i/>
             <w:iCs/>
           </w:rPr>
-          <w:t xml:space="preserve">Introduction to Probability and Statistics</w:t>
-        </w:r>
-      </w:hyperlink>
-      <w:r>
-        <w:t xml:space="preserve"> </w:t>
-      </w:r>
-      <w:r>
-        <w:t xml:space="preserve">(Jeremy Orloff and Jonathan Bloom, MIT OpenCourseWare) bridges probability, discrete and continuous random variables, and both Bayesian and frequentist statistical inference.</w:t>
+          <w:t xml:space="preserve">Introduction to Probability</w:t>
+        </w:r>
+      </w:hyperlink>
+      <w:r>
+        <w:t xml:space="preserve"> </w:t>
+      </w:r>
+      <w:r>
+        <w:t xml:space="preserve">(Joseph K. Blitzstein; companion textbook</w:t>
+      </w:r>
+      <w:r>
+        <w:t xml:space="preserve"> </w:t>
+      </w:r>
+      <w:r>
+        <w:t xml:space="preserve">Blitzstein and Hwang (2019)</w:t>
+      </w:r>
+      <w:r>
+        <w:t xml:space="preserve">, online at</w:t>
+      </w:r>
+      <w:r>
+        <w:t xml:space="preserve"> </w:t>
+      </w:r>
+      <w:hyperlink r:id="rId29">
+        <w:r>
+          <w:rPr>
+            <w:rStyle w:val="Hyperlink"/>
+          </w:rPr>
+          <w:t xml:space="preserve">probabilitybook.net</w:t>
+        </w:r>
+      </w:hyperlink>
+      <w:r>
+        <w:t xml:space="preserve">) covers conditioning, distributions, transform methods, and Markov chains with an emphasis on intuitive storytelling.</w:t>
       </w:r>
     </w:p>
     <w:p>
@@ -780,7 +828,7 @@
           <w:b/>
           <w:bCs/>
         </w:rPr>
-        <w:t xml:space="preserve">MIT 6.041 / 6.431</w:t>
+        <w:t xml:space="preserve">MIT 18.05</w:t>
       </w:r>
       <w:r>
         <w:t xml:space="preserve">:</w:t>
@@ -788,21 +836,21 @@
       <w:r>
         <w:t xml:space="preserve"> </w:t>
       </w:r>
-      <w:hyperlink r:id="rId27">
+      <w:hyperlink r:id="rId30">
         <w:r>
           <w:rPr>
             <w:rStyle w:val="Hyperlink"/>
             <w:i/>
             <w:iCs/>
           </w:rPr>
-          <w:t xml:space="preserve">Probabilistic Systems Analysis and Applied Probability</w:t>
-        </w:r>
-      </w:hyperlink>
-      <w:r>
-        <w:t xml:space="preserve"> </w:t>
-      </w:r>
-      <w:r>
-        <w:t xml:space="preserve">(John Tsitsiklis, MIT OpenCourseWare) covers probability spaces, conditioning, independence, transform methods, and Bernoulli and Poisson processes.</w:t>
+          <w:t xml:space="preserve">Introduction to Probability and Statistics</w:t>
+        </w:r>
+      </w:hyperlink>
+      <w:r>
+        <w:t xml:space="preserve"> </w:t>
+      </w:r>
+      <w:r>
+        <w:t xml:space="preserve">(Jeremy Orloff and Jonathan Bloom, MIT OpenCourseWare) bridges probability, discrete and continuous random variables, and both Bayesian and frequentist statistical inference.</w:t>
       </w:r>
     </w:p>
     <w:p>
@@ -818,7 +866,7 @@
           <w:b/>
           <w:bCs/>
         </w:rPr>
-        <w:t xml:space="preserve">Cal Poly / Kevin Ross</w:t>
+        <w:t xml:space="preserve">MIT 6.041 / 6.431</w:t>
       </w:r>
       <w:r>
         <w:t xml:space="preserve">:</w:t>
@@ -826,13 +874,51 @@
       <w:r>
         <w:t xml:space="preserve"> </w:t>
       </w:r>
-      <w:hyperlink r:id="rId28">
+      <w:hyperlink r:id="rId31">
         <w:r>
           <w:rPr>
             <w:rStyle w:val="Hyperlink"/>
             <w:i/>
             <w:iCs/>
           </w:rPr>
+          <w:t xml:space="preserve">Probabilistic Systems Analysis and Applied Probability</w:t>
+        </w:r>
+      </w:hyperlink>
+      <w:r>
+        <w:t xml:space="preserve"> </w:t>
+      </w:r>
+      <w:r>
+        <w:t xml:space="preserve">(John Tsitsiklis, MIT OpenCourseWare) covers probability spaces, conditioning, independence, transform methods, and Bernoulli and Poisson processes.</w:t>
+      </w:r>
+    </w:p>
+    <w:p>
+      <w:pPr>
+        <w:pStyle w:val="Compact"/>
+        <w:numPr>
+          <w:ilvl w:val="0"/>
+          <w:numId w:val="1002"/>
+        </w:numPr>
+      </w:pPr>
+      <w:r>
+        <w:rPr>
+          <w:b/>
+          <w:bCs/>
+        </w:rPr>
+        <w:t xml:space="preserve">Cal Poly / Kevin Ross</w:t>
+      </w:r>
+      <w:r>
+        <w:t xml:space="preserve">:</w:t>
+      </w:r>
+      <w:r>
+        <w:t xml:space="preserve"> </w:t>
+      </w:r>
+      <w:hyperlink r:id="rId32">
+        <w:r>
+          <w:rPr>
+            <w:rStyle w:val="Hyperlink"/>
+            <w:i/>
+            <w:iCs/>
+          </w:rPr>
           <w:t xml:space="preserve">An Introduction to Probability and Simulation</w:t>
         </w:r>
       </w:hyperlink>
@@ -873,8 +959,8 @@
         <w:t xml:space="preserve">in conditional expectation.</w:t>
       </w:r>
     </w:p>
-    <w:bookmarkEnd w:id="29"/>
-    <w:bookmarkStart w:id="30" w:name="textbooks-and-companion-notes"/>
+    <w:bookmarkEnd w:id="33"/>
+    <w:bookmarkStart w:id="34" w:name="textbooks-and-companion-notes"/>
     <w:p>
       <w:pPr>
         <w:pStyle w:val="Heading3"/>
@@ -1002,8 +1088,8 @@
         <w:t xml:space="preserve">which applies this material to regression and survival analysis</w:t>
       </w:r>
     </w:p>
-    <w:bookmarkEnd w:id="30"/>
-    <w:bookmarkStart w:id="32" w:name="video-channels"/>
+    <w:bookmarkEnd w:id="34"/>
+    <w:bookmarkStart w:id="36" w:name="video-channels"/>
     <w:p>
       <w:pPr>
         <w:pStyle w:val="Heading3"/>
@@ -1022,7 +1108,7 @@
       <w:r>
         <w:t xml:space="preserve"> </w:t>
       </w:r>
-      <w:hyperlink r:id="rId31">
+      <w:hyperlink r:id="rId35">
         <w:r>
           <w:rPr>
             <w:rStyle w:val="Hyperlink"/>
@@ -1040,9 +1126,9 @@
         <w:t xml:space="preserve">with levels, for probability and statistics as well as machine learning, AI, computer science and mathematics.</w:t>
       </w:r>
     </w:p>
-    <w:bookmarkEnd w:id="32"/>
-    <w:bookmarkEnd w:id="33"/>
-    <w:bookmarkStart w:id="45" w:name="references"/>
+    <w:bookmarkEnd w:id="36"/>
+    <w:bookmarkEnd w:id="37"/>
+    <w:bookmarkStart w:id="49" w:name="references"/>
     <w:p>
       <w:pPr>
         <w:pStyle w:val="Heading2"/>
@@ -1051,8 +1137,8 @@
         <w:t xml:space="preserve">References</w:t>
       </w:r>
     </w:p>
-    <w:bookmarkStart w:id="44" w:name="refs"/>
-    <w:bookmarkStart w:id="35" w:name="ref-blitzstein2019introduction"/>
+    <w:bookmarkStart w:id="48" w:name="refs"/>
+    <w:bookmarkStart w:id="39" w:name="ref-blitzstein2019introduction"/>
     <w:p>
       <w:pPr>
         <w:pStyle w:val="Bibliography"/>
@@ -1076,7 +1162,7 @@
       <w:r>
         <w:t xml:space="preserve"> </w:t>
       </w:r>
-      <w:hyperlink r:id="rId34">
+      <w:hyperlink r:id="rId38">
         <w:r>
           <w:rPr>
             <w:rStyle w:val="Hyperlink"/>
@@ -1088,8 +1174,8 @@
         <w:t xml:space="preserve">.</w:t>
       </w:r>
     </w:p>
-    <w:bookmarkEnd w:id="35"/>
-    <w:bookmarkStart w:id="36" w:name="ref-dembo-notes"/>
+    <w:bookmarkEnd w:id="39"/>
+    <w:bookmarkStart w:id="40" w:name="ref-dembo-notes"/>
     <w:p>
       <w:pPr>
         <w:pStyle w:val="Bibliography"/>
@@ -1125,8 +1211,8 @@
         <w:t xml:space="preserve">.</w:t>
       </w:r>
     </w:p>
-    <w:bookmarkEnd w:id="36"/>
-    <w:bookmarkStart w:id="38" w:name="ref-hastie2009elements"/>
+    <w:bookmarkEnd w:id="40"/>
+    <w:bookmarkStart w:id="42" w:name="ref-hastie2009elements"/>
     <w:p>
       <w:pPr>
         <w:pStyle w:val="Bibliography"/>
@@ -1150,7 +1236,7 @@
       <w:r>
         <w:t xml:space="preserve"> </w:t>
       </w:r>
-      <w:hyperlink r:id="rId37">
+      <w:hyperlink r:id="rId41">
         <w:r>
           <w:rPr>
             <w:rStyle w:val="Hyperlink"/>
@@ -1162,8 +1248,8 @@
         <w:t xml:space="preserve">.</w:t>
       </w:r>
     </w:p>
-    <w:bookmarkEnd w:id="38"/>
-    <w:bookmarkStart w:id="40" w:name="ref-james2021islr2e"/>
+    <w:bookmarkEnd w:id="42"/>
+    <w:bookmarkStart w:id="44" w:name="ref-james2021islr2e"/>
     <w:p>
       <w:pPr>
         <w:pStyle w:val="Bibliography"/>
@@ -1201,7 +1287,7 @@
       <w:r>
         <w:t xml:space="preserve"> </w:t>
       </w:r>
-      <w:hyperlink r:id="rId39">
+      <w:hyperlink r:id="rId43">
         <w:r>
           <w:rPr>
             <w:rStyle w:val="Hyperlink"/>
@@ -1213,8 +1299,8 @@
         <w:t xml:space="preserve">.</w:t>
       </w:r>
     </w:p>
-    <w:bookmarkEnd w:id="40"/>
-    <w:bookmarkStart w:id="42" w:name="ref-problifesaver"/>
+    <w:bookmarkEnd w:id="44"/>
+    <w:bookmarkStart w:id="46" w:name="ref-problifesaver"/>
     <w:p>
       <w:pPr>
         <w:pStyle w:val="Bibliography"/>
@@ -1238,7 +1324,7 @@
       <w:r>
         <w:t xml:space="preserve"> </w:t>
       </w:r>
-      <w:hyperlink r:id="rId41">
+      <w:hyperlink r:id="rId45">
         <w:r>
           <w:rPr>
             <w:rStyle w:val="Hyperlink"/>
@@ -1250,8 +1336,8 @@
         <w:t xml:space="preserve">.</w:t>
       </w:r>
     </w:p>
-    <w:bookmarkEnd w:id="42"/>
-    <w:bookmarkStart w:id="43" w:name="ref-ross-probsim"/>
+    <w:bookmarkEnd w:id="46"/>
+    <w:bookmarkStart w:id="47" w:name="ref-ross-probsim"/>
     <w:p>
       <w:pPr>
         <w:pStyle w:val="Bibliography"/>
@@ -1275,7 +1361,7 @@
       <w:r>
         <w:t xml:space="preserve"> </w:t>
       </w:r>
-      <w:hyperlink r:id="rId28">
+      <w:hyperlink r:id="rId32">
         <w:r>
           <w:rPr>
             <w:rStyle w:val="Hyperlink"/>
@@ -1287,9 +1373,9 @@
         <w:t xml:space="preserve">.</w:t>
       </w:r>
     </w:p>
-    <w:bookmarkEnd w:id="43"/>
-    <w:bookmarkEnd w:id="44"/>
-    <w:bookmarkEnd w:id="45"/>
+    <w:bookmarkEnd w:id="47"/>
+    <w:bookmarkEnd w:id="48"/>
+    <w:bookmarkEnd w:id="49"/>
     <w:sectPr>
       <w:footnotePr>
         <w:numRestart w:val="eachSect"/>

</xml_diff>

<commit_message>
Deploying to gh-pages from @ Morrison-Lab/pds@9cda645bb003854db1a50fb849055cf10967dd95 🚀
</commit_message>
<xml_diff>
--- a/index.docx
+++ b/index.docx
@@ -15,7 +15,7 @@
         <w:pStyle w:val="Date"/>
       </w:pPr>
       <w:r>
-        <w:t xml:space="preserve">Last modified: 2026-10-13 15:27:43 (PDT)</w:t>
+        <w:t xml:space="preserve">Last modified: 2026-10-13 16:32:42 (PDT)</w:t>
       </w:r>
     </w:p>
     <w:bookmarkStart w:id="18" w:name="welcome"/>
@@ -511,7 +511,7 @@
       </w:r>
     </w:p>
     <w:bookmarkEnd w:id="19"/>
-    <w:bookmarkStart w:id="37" w:name="sec-additional-resources"/>
+    <w:bookmarkStart w:id="39" w:name="sec-additional-resources"/>
     <w:p>
       <w:pPr>
         <w:pStyle w:val="Heading2"/>
@@ -960,7 +960,7 @@
       </w:r>
     </w:p>
     <w:bookmarkEnd w:id="33"/>
-    <w:bookmarkStart w:id="34" w:name="textbooks-and-companion-notes"/>
+    <w:bookmarkStart w:id="36" w:name="textbooks-and-companion-notes"/>
     <w:p>
       <w:pPr>
         <w:pStyle w:val="Heading3"/>
@@ -1063,18 +1063,80 @@
         </w:numPr>
       </w:pPr>
       <w:r>
-        <w:t xml:space="preserve">Morrison Lab’s</w:t>
-      </w:r>
-      <w:r>
-        <w:t xml:space="preserve"> </w:t>
-      </w:r>
-      <w:hyperlink r:id="rId17">
+        <w:t xml:space="preserve">Amir Dembo,</w:t>
+      </w:r>
+      <w:r>
+        <w:t xml:space="preserve"> </w:t>
+      </w:r>
+      <w:hyperlink r:id="rId34">
         <w:r>
           <w:rPr>
             <w:rStyle w:val="Hyperlink"/>
             <w:i/>
             <w:iCs/>
           </w:rPr>
+          <w:t xml:space="preserve">Probability Theory</w:t>
+        </w:r>
+      </w:hyperlink>
+      <w:r>
+        <w:t xml:space="preserve"> </w:t>
+      </w:r>
+      <w:r>
+        <w:t xml:space="preserve">lecture notes (Stanford STAT 310 / MATH 230, the measure-theoretic sequel to this material; used in STATS 310B)</w:t>
+      </w:r>
+    </w:p>
+    <w:p>
+      <w:pPr>
+        <w:pStyle w:val="Compact"/>
+        <w:numPr>
+          <w:ilvl w:val="0"/>
+          <w:numId w:val="1003"/>
+        </w:numPr>
+      </w:pPr>
+      <w:r>
+        <w:t xml:space="preserve">John Duchi,</w:t>
+      </w:r>
+      <w:r>
+        <w:t xml:space="preserve"> </w:t>
+      </w:r>
+      <w:hyperlink r:id="rId35">
+        <w:r>
+          <w:rPr>
+            <w:rStyle w:val="Hyperlink"/>
+            <w:i/>
+            <w:iCs/>
+          </w:rPr>
+          <w:t xml:space="preserve">Lecture Notes on Statistics and Information Theory</w:t>
+        </w:r>
+      </w:hyperlink>
+      <w:r>
+        <w:t xml:space="preserve"> </w:t>
+      </w:r>
+      <w:r>
+        <w:t xml:space="preserve">(Stanford STATS 311), which develops entropy and divergences beyond the definitions here</w:t>
+      </w:r>
+    </w:p>
+    <w:p>
+      <w:pPr>
+        <w:pStyle w:val="Compact"/>
+        <w:numPr>
+          <w:ilvl w:val="0"/>
+          <w:numId w:val="1003"/>
+        </w:numPr>
+      </w:pPr>
+      <w:r>
+        <w:t xml:space="preserve">Morrison Lab’s</w:t>
+      </w:r>
+      <w:r>
+        <w:t xml:space="preserve"> </w:t>
+      </w:r>
+      <w:hyperlink r:id="rId17">
+        <w:r>
+          <w:rPr>
+            <w:rStyle w:val="Hyperlink"/>
+            <w:i/>
+            <w:iCs/>
+          </w:rPr>
           <w:t xml:space="preserve">Regression Models for Epidemiology</w:t>
         </w:r>
       </w:hyperlink>
@@ -1088,8 +1150,8 @@
         <w:t xml:space="preserve">which applies this material to regression and survival analysis</w:t>
       </w:r>
     </w:p>
-    <w:bookmarkEnd w:id="34"/>
-    <w:bookmarkStart w:id="36" w:name="video-channels"/>
+    <w:bookmarkEnd w:id="36"/>
+    <w:bookmarkStart w:id="38" w:name="video-channels"/>
     <w:p>
       <w:pPr>
         <w:pStyle w:val="Heading3"/>
@@ -1108,7 +1170,7 @@
       <w:r>
         <w:t xml:space="preserve"> </w:t>
       </w:r>
-      <w:hyperlink r:id="rId35">
+      <w:hyperlink r:id="rId37">
         <w:r>
           <w:rPr>
             <w:rStyle w:val="Hyperlink"/>
@@ -1126,9 +1188,9 @@
         <w:t xml:space="preserve">with levels, for probability and statistics as well as machine learning, AI, computer science and mathematics.</w:t>
       </w:r>
     </w:p>
-    <w:bookmarkEnd w:id="36"/>
-    <w:bookmarkEnd w:id="37"/>
-    <w:bookmarkStart w:id="49" w:name="references"/>
+    <w:bookmarkEnd w:id="38"/>
+    <w:bookmarkEnd w:id="39"/>
+    <w:bookmarkStart w:id="51" w:name="references"/>
     <w:p>
       <w:pPr>
         <w:pStyle w:val="Heading2"/>
@@ -1137,8 +1199,8 @@
         <w:t xml:space="preserve">References</w:t>
       </w:r>
     </w:p>
-    <w:bookmarkStart w:id="48" w:name="refs"/>
-    <w:bookmarkStart w:id="39" w:name="ref-blitzstein2019introduction"/>
+    <w:bookmarkStart w:id="50" w:name="refs"/>
+    <w:bookmarkStart w:id="41" w:name="ref-blitzstein2019introduction"/>
     <w:p>
       <w:pPr>
         <w:pStyle w:val="Bibliography"/>
@@ -1162,7 +1224,7 @@
       <w:r>
         <w:t xml:space="preserve"> </w:t>
       </w:r>
-      <w:hyperlink r:id="rId38">
+      <w:hyperlink r:id="rId40">
         <w:r>
           <w:rPr>
             <w:rStyle w:val="Hyperlink"/>
@@ -1174,8 +1236,8 @@
         <w:t xml:space="preserve">.</w:t>
       </w:r>
     </w:p>
-    <w:bookmarkEnd w:id="39"/>
-    <w:bookmarkStart w:id="40" w:name="ref-dembo-notes"/>
+    <w:bookmarkEnd w:id="41"/>
+    <w:bookmarkStart w:id="42" w:name="ref-dembo-notes"/>
     <w:p>
       <w:pPr>
         <w:pStyle w:val="Bibliography"/>
@@ -1211,8 +1273,8 @@
         <w:t xml:space="preserve">.</w:t>
       </w:r>
     </w:p>
-    <w:bookmarkEnd w:id="40"/>
-    <w:bookmarkStart w:id="42" w:name="ref-hastie2009elements"/>
+    <w:bookmarkEnd w:id="42"/>
+    <w:bookmarkStart w:id="44" w:name="ref-hastie2009elements"/>
     <w:p>
       <w:pPr>
         <w:pStyle w:val="Bibliography"/>
@@ -1236,7 +1298,7 @@
       <w:r>
         <w:t xml:space="preserve"> </w:t>
       </w:r>
-      <w:hyperlink r:id="rId41">
+      <w:hyperlink r:id="rId43">
         <w:r>
           <w:rPr>
             <w:rStyle w:val="Hyperlink"/>
@@ -1248,8 +1310,8 @@
         <w:t xml:space="preserve">.</w:t>
       </w:r>
     </w:p>
-    <w:bookmarkEnd w:id="42"/>
-    <w:bookmarkStart w:id="44" w:name="ref-james2021islr2e"/>
+    <w:bookmarkEnd w:id="44"/>
+    <w:bookmarkStart w:id="46" w:name="ref-james2021islr2e"/>
     <w:p>
       <w:pPr>
         <w:pStyle w:val="Bibliography"/>
@@ -1287,7 +1349,7 @@
       <w:r>
         <w:t xml:space="preserve"> </w:t>
       </w:r>
-      <w:hyperlink r:id="rId43">
+      <w:hyperlink r:id="rId45">
         <w:r>
           <w:rPr>
             <w:rStyle w:val="Hyperlink"/>
@@ -1299,8 +1361,8 @@
         <w:t xml:space="preserve">.</w:t>
       </w:r>
     </w:p>
-    <w:bookmarkEnd w:id="44"/>
-    <w:bookmarkStart w:id="46" w:name="ref-problifesaver"/>
+    <w:bookmarkEnd w:id="46"/>
+    <w:bookmarkStart w:id="48" w:name="ref-problifesaver"/>
     <w:p>
       <w:pPr>
         <w:pStyle w:val="Bibliography"/>
@@ -1324,7 +1386,7 @@
       <w:r>
         <w:t xml:space="preserve"> </w:t>
       </w:r>
-      <w:hyperlink r:id="rId45">
+      <w:hyperlink r:id="rId47">
         <w:r>
           <w:rPr>
             <w:rStyle w:val="Hyperlink"/>
@@ -1336,8 +1398,8 @@
         <w:t xml:space="preserve">.</w:t>
       </w:r>
     </w:p>
-    <w:bookmarkEnd w:id="46"/>
-    <w:bookmarkStart w:id="47" w:name="ref-ross-probsim"/>
+    <w:bookmarkEnd w:id="48"/>
+    <w:bookmarkStart w:id="49" w:name="ref-ross-probsim"/>
     <w:p>
       <w:pPr>
         <w:pStyle w:val="Bibliography"/>
@@ -1373,9 +1435,9 @@
         <w:t xml:space="preserve">.</w:t>
       </w:r>
     </w:p>
-    <w:bookmarkEnd w:id="47"/>
-    <w:bookmarkEnd w:id="48"/>
     <w:bookmarkEnd w:id="49"/>
+    <w:bookmarkEnd w:id="50"/>
+    <w:bookmarkEnd w:id="51"/>
     <w:sectPr>
       <w:footnotePr>
         <w:numRestart w:val="eachSect"/>

</xml_diff>

<commit_message>
Deploying to gh-pages from @ Morrison-Lab/pds@f58222b5f24f63fe4fd88071278ac7c3f9491278 🚀
</commit_message>
<xml_diff>
--- a/index.docx
+++ b/index.docx
@@ -15,7 +15,7 @@
         <w:pStyle w:val="Date"/>
       </w:pPr>
       <w:r>
-        <w:t xml:space="preserve">Last modified: 2026-10-13 22:42:42 (PDT)</w:t>
+        <w:t xml:space="preserve">Last modified: 2026-10-14 00:28:11 (PDT)</w:t>
       </w:r>
     </w:p>
     <w:bookmarkStart w:id="18" w:name="welcome"/>
@@ -261,7 +261,7 @@
         <w:t xml:space="preserve"> </w:t>
       </w:r>
       <w:r>
-        <w:t xml:space="preserve">Bernoulli, Poisson, negative binomial, and Weibull distributions</w:t>
+        <w:t xml:space="preserve">Bernoulli, binomial, Poisson, negative binomial, and Weibull distributions</w:t>
       </w:r>
     </w:p>
     <w:p>

</xml_diff>

<commit_message>
Deploying to gh-pages from @ Morrison-Lab/pds@b79cc2c1a17b0787ec766d9e8a7a926cc1352d1e 🚀
</commit_message>
<xml_diff>
--- a/index.docx
+++ b/index.docx
@@ -15,7 +15,7 @@
         <w:pStyle w:val="Date"/>
       </w:pPr>
       <w:r>
-        <w:t xml:space="preserve">Last modified: 2026-10-29 08:00:26 (PDT)</w:t>
+        <w:t xml:space="preserve">Last modified: 2026-10-29 13:28:09 (PDT)</w:t>
       </w:r>
     </w:p>
     <w:bookmarkStart w:id="18" w:name="welcome"/>
@@ -511,7 +511,7 @@
       </w:r>
     </w:p>
     <w:bookmarkEnd w:id="19"/>
-    <w:bookmarkStart w:id="39" w:name="sec-additional-resources"/>
+    <w:bookmarkStart w:id="40" w:name="sec-additional-resources"/>
     <w:p>
       <w:pPr>
         <w:pStyle w:val="Heading2"/>
@@ -960,7 +960,7 @@
       </w:r>
     </w:p>
     <w:bookmarkEnd w:id="33"/>
-    <w:bookmarkStart w:id="36" w:name="textbooks-and-companion-notes"/>
+    <w:bookmarkStart w:id="37" w:name="textbooks-and-companion-notes"/>
     <w:p>
       <w:pPr>
         <w:pStyle w:val="Heading3"/>
@@ -978,7 +978,27 @@
         </w:numPr>
       </w:pPr>
       <w:r>
-        <w:t xml:space="preserve">Miller [3]</w:t>
+        <w:t xml:space="preserve">Ross [3]</w:t>
+      </w:r>
+      <w:r>
+        <w:t xml:space="preserve">, an undergraduate calculus-based</w:t>
+      </w:r>
+      <w:r>
+        <w:t xml:space="preserve"> </w:t>
+      </w:r>
+      <w:hyperlink r:id="rId34">
+        <w:r>
+          <w:rPr>
+            <w:rStyle w:val="Hyperlink"/>
+          </w:rPr>
+          <w:t xml:space="preserve">probability</w:t>
+        </w:r>
+      </w:hyperlink>
+      <w:r>
+        <w:t xml:space="preserve"> </w:t>
+      </w:r>
+      <w:r>
+        <w:t xml:space="preserve">text</w:t>
       </w:r>
     </w:p>
     <w:p>
@@ -990,7 +1010,16 @@
         </w:numPr>
       </w:pPr>
       <w:r>
-        <w:t xml:space="preserve">Blitzstein and Hwang [1]</w:t>
+        <w:t xml:space="preserve">Gut [4]</w:t>
+      </w:r>
+      <w:r>
+        <w:t xml:space="preserve">, a graduate text on the measure-theoretic foundations of probability, as a companion to</w:t>
+      </w:r>
+      <w:r>
+        <w:t xml:space="preserve"> </w:t>
+      </w:r>
+      <w:r>
+        <w:t xml:space="preserve">Billingsley [5]</w:t>
       </w:r>
     </w:p>
     <w:p>
@@ -1002,7 +1031,7 @@
         </w:numPr>
       </w:pPr>
       <w:r>
-        <w:t xml:space="preserve">Hastie et al. [4]</w:t>
+        <w:t xml:space="preserve">Miller [6]</w:t>
       </w:r>
     </w:p>
     <w:p>
@@ -1014,7 +1043,7 @@
         </w:numPr>
       </w:pPr>
       <w:r>
-        <w:t xml:space="preserve">James et al. [5]</w:t>
+        <w:t xml:space="preserve">Blitzstein and Hwang [1]</w:t>
       </w:r>
     </w:p>
     <w:p>
@@ -1026,32 +1055,7 @@
         </w:numPr>
       </w:pPr>
       <w:r>
-        <w:t xml:space="preserve">Amir Dembo and Kevin Ross,</w:t>
-      </w:r>
-      <w:r>
-        <w:t xml:space="preserve"> </w:t>
-      </w:r>
-      <w:hyperlink r:id="rId22">
-        <w:r>
-          <w:rPr>
-            <w:rStyle w:val="Hyperlink"/>
-            <w:i/>
-            <w:iCs/>
-          </w:rPr>
-          <w:t xml:space="preserve">Stochastic Processes</w:t>
-        </w:r>
-      </w:hyperlink>
-      <w:r>
-        <w:t xml:space="preserve"> </w:t>
-      </w:r>
-      <w:r>
-        <w:t xml:space="preserve">lecture notes (</w:t>
-      </w:r>
-      <w:r>
-        <w:t xml:space="preserve">Dembo and Ross [6]</w:t>
-      </w:r>
-      <w:r>
-        <w:t xml:space="preserve">, Stanford MATH 136 / STAT 219)</w:t>
+        <w:t xml:space="preserve">Hastie et al. [7]</w:t>
       </w:r>
     </w:p>
     <w:p>
@@ -1063,26 +1067,7 @@
         </w:numPr>
       </w:pPr>
       <w:r>
-        <w:t xml:space="preserve">Amir Dembo,</w:t>
-      </w:r>
-      <w:r>
-        <w:t xml:space="preserve"> </w:t>
-      </w:r>
-      <w:hyperlink r:id="rId34">
-        <w:r>
-          <w:rPr>
-            <w:rStyle w:val="Hyperlink"/>
-            <w:i/>
-            <w:iCs/>
-          </w:rPr>
-          <w:t xml:space="preserve">Probability Theory</w:t>
-        </w:r>
-      </w:hyperlink>
-      <w:r>
-        <w:t xml:space="preserve"> </w:t>
-      </w:r>
-      <w:r>
-        <w:t xml:space="preserve">lecture notes (Stanford STAT 310 / MATH 230, the measure-theoretic sequel to this material; used in STATS 310B)</w:t>
+        <w:t xml:space="preserve">James et al. [8]</w:t>
       </w:r>
     </w:p>
     <w:p>
@@ -1094,26 +1079,32 @@
         </w:numPr>
       </w:pPr>
       <w:r>
-        <w:t xml:space="preserve">John Duchi,</w:t>
-      </w:r>
-      <w:r>
-        <w:t xml:space="preserve"> </w:t>
-      </w:r>
-      <w:hyperlink r:id="rId35">
+        <w:t xml:space="preserve">Amir Dembo and Kevin Ross,</w:t>
+      </w:r>
+      <w:r>
+        <w:t xml:space="preserve"> </w:t>
+      </w:r>
+      <w:hyperlink r:id="rId22">
         <w:r>
           <w:rPr>
             <w:rStyle w:val="Hyperlink"/>
             <w:i/>
             <w:iCs/>
           </w:rPr>
-          <w:t xml:space="preserve">Lecture Notes on Statistics and Information Theory</w:t>
-        </w:r>
-      </w:hyperlink>
-      <w:r>
-        <w:t xml:space="preserve"> </w:t>
-      </w:r>
-      <w:r>
-        <w:t xml:space="preserve">(Stanford STATS 311), which develops entropy and divergences beyond the definitions here</w:t>
+          <w:t xml:space="preserve">Stochastic Processes</w:t>
+        </w:r>
+      </w:hyperlink>
+      <w:r>
+        <w:t xml:space="preserve"> </w:t>
+      </w:r>
+      <w:r>
+        <w:t xml:space="preserve">lecture notes (</w:t>
+      </w:r>
+      <w:r>
+        <w:t xml:space="preserve">Dembo and Ross [9]</w:t>
+      </w:r>
+      <w:r>
+        <w:t xml:space="preserve">, Stanford MATH 136 / STAT 219)</w:t>
       </w:r>
     </w:p>
     <w:p>
@@ -1125,18 +1116,80 @@
         </w:numPr>
       </w:pPr>
       <w:r>
-        <w:t xml:space="preserve">Morrison Lab’s</w:t>
-      </w:r>
-      <w:r>
-        <w:t xml:space="preserve"> </w:t>
-      </w:r>
-      <w:hyperlink r:id="rId17">
+        <w:t xml:space="preserve">Amir Dembo,</w:t>
+      </w:r>
+      <w:r>
+        <w:t xml:space="preserve"> </w:t>
+      </w:r>
+      <w:hyperlink r:id="rId35">
         <w:r>
           <w:rPr>
             <w:rStyle w:val="Hyperlink"/>
             <w:i/>
             <w:iCs/>
           </w:rPr>
+          <w:t xml:space="preserve">Probability Theory</w:t>
+        </w:r>
+      </w:hyperlink>
+      <w:r>
+        <w:t xml:space="preserve"> </w:t>
+      </w:r>
+      <w:r>
+        <w:t xml:space="preserve">lecture notes (Stanford STAT 310 / MATH 230, the measure-theoretic sequel to this material; used in STATS 310B)</w:t>
+      </w:r>
+    </w:p>
+    <w:p>
+      <w:pPr>
+        <w:pStyle w:val="Compact"/>
+        <w:numPr>
+          <w:ilvl w:val="0"/>
+          <w:numId w:val="1003"/>
+        </w:numPr>
+      </w:pPr>
+      <w:r>
+        <w:t xml:space="preserve">John Duchi,</w:t>
+      </w:r>
+      <w:r>
+        <w:t xml:space="preserve"> </w:t>
+      </w:r>
+      <w:hyperlink r:id="rId36">
+        <w:r>
+          <w:rPr>
+            <w:rStyle w:val="Hyperlink"/>
+            <w:i/>
+            <w:iCs/>
+          </w:rPr>
+          <w:t xml:space="preserve">Lecture Notes on Statistics and Information Theory</w:t>
+        </w:r>
+      </w:hyperlink>
+      <w:r>
+        <w:t xml:space="preserve"> </w:t>
+      </w:r>
+      <w:r>
+        <w:t xml:space="preserve">(Stanford STATS 311), which develops entropy and divergences beyond the definitions here</w:t>
+      </w:r>
+    </w:p>
+    <w:p>
+      <w:pPr>
+        <w:pStyle w:val="Compact"/>
+        <w:numPr>
+          <w:ilvl w:val="0"/>
+          <w:numId w:val="1003"/>
+        </w:numPr>
+      </w:pPr>
+      <w:r>
+        <w:t xml:space="preserve">Morrison Lab’s</w:t>
+      </w:r>
+      <w:r>
+        <w:t xml:space="preserve"> </w:t>
+      </w:r>
+      <w:hyperlink r:id="rId17">
+        <w:r>
+          <w:rPr>
+            <w:rStyle w:val="Hyperlink"/>
+            <w:i/>
+            <w:iCs/>
+          </w:rPr>
           <w:t xml:space="preserve">Regression Models for Epidemiology</w:t>
         </w:r>
       </w:hyperlink>
@@ -1150,8 +1203,8 @@
         <w:t xml:space="preserve">which applies this material to regression and survival analysis</w:t>
       </w:r>
     </w:p>
-    <w:bookmarkEnd w:id="36"/>
-    <w:bookmarkStart w:id="38" w:name="video-channels"/>
+    <w:bookmarkEnd w:id="37"/>
+    <w:bookmarkStart w:id="39" w:name="video-channels"/>
     <w:p>
       <w:pPr>
         <w:pStyle w:val="Heading3"/>
@@ -1170,7 +1223,7 @@
       <w:r>
         <w:t xml:space="preserve"> </w:t>
       </w:r>
-      <w:hyperlink r:id="rId37">
+      <w:hyperlink r:id="rId38">
         <w:r>
           <w:rPr>
             <w:rStyle w:val="Hyperlink"/>
@@ -1188,9 +1241,9 @@
         <w:t xml:space="preserve">with levels, for probability and statistics as well as machine learning, AI, computer science and mathematics.</w:t>
       </w:r>
     </w:p>
-    <w:bookmarkEnd w:id="38"/>
     <w:bookmarkEnd w:id="39"/>
-    <w:bookmarkStart w:id="51" w:name="references"/>
+    <w:bookmarkEnd w:id="40"/>
+    <w:bookmarkStart w:id="56" w:name="references"/>
     <w:p>
       <w:pPr>
         <w:pStyle w:val="Heading2"/>
@@ -1199,8 +1252,8 @@
         <w:t xml:space="preserve">References</w:t>
       </w:r>
     </w:p>
-    <w:bookmarkStart w:id="50" w:name="refs"/>
-    <w:bookmarkStart w:id="41" w:name="ref-blitzstein2019introduction"/>
+    <w:bookmarkStart w:id="55" w:name="refs"/>
+    <w:bookmarkStart w:id="42" w:name="ref-blitzstein2019introduction"/>
     <w:p>
       <w:pPr>
         <w:pStyle w:val="Bibliography"/>
@@ -1233,7 +1286,7 @@
       <w:r>
         <w:t xml:space="preserve"> </w:t>
       </w:r>
-      <w:hyperlink r:id="rId40">
+      <w:hyperlink r:id="rId41">
         <w:r>
           <w:rPr>
             <w:rStyle w:val="Hyperlink"/>
@@ -1245,8 +1298,8 @@
         <w:t xml:space="preserve">.</w:t>
       </w:r>
     </w:p>
-    <w:bookmarkEnd w:id="41"/>
-    <w:bookmarkStart w:id="42" w:name="ref-ross-probsim"/>
+    <w:bookmarkEnd w:id="42"/>
+    <w:bookmarkStart w:id="43" w:name="ref-ross-probsim"/>
     <w:p>
       <w:pPr>
         <w:pStyle w:val="Bibliography"/>
@@ -1287,14 +1340,124 @@
         </w:r>
       </w:hyperlink>
     </w:p>
-    <w:bookmarkEnd w:id="42"/>
-    <w:bookmarkStart w:id="44" w:name="ref-problifesaver"/>
+    <w:bookmarkEnd w:id="43"/>
+    <w:bookmarkStart w:id="44" w:name="ref-ross2019first"/>
     <w:p>
       <w:pPr>
         <w:pStyle w:val="Bibliography"/>
       </w:pPr>
       <w:r>
         <w:t xml:space="preserve">[3]</w:t>
+      </w:r>
+      <w:r>
+        <w:t xml:space="preserve"> </w:t>
+      </w:r>
+      <w:r>
+        <w:t xml:space="preserve">	</w:t>
+      </w:r>
+      <w:r>
+        <w:t xml:space="preserve">S. M. Ross,</w:t>
+      </w:r>
+      <w:r>
+        <w:t xml:space="preserve"> </w:t>
+      </w:r>
+      <w:r>
+        <w:rPr>
+          <w:i/>
+          <w:iCs/>
+        </w:rPr>
+        <w:t xml:space="preserve">A first course in probability</w:t>
+      </w:r>
+      <w:r>
+        <w:t xml:space="preserve">, 10th ed. Hoboken, NJ: Pearson, 2019.</w:t>
+      </w:r>
+    </w:p>
+    <w:bookmarkEnd w:id="44"/>
+    <w:bookmarkStart w:id="46" w:name="ref-gut2013"/>
+    <w:p>
+      <w:pPr>
+        <w:pStyle w:val="Bibliography"/>
+      </w:pPr>
+      <w:r>
+        <w:t xml:space="preserve">[4]</w:t>
+      </w:r>
+      <w:r>
+        <w:t xml:space="preserve"> </w:t>
+      </w:r>
+      <w:r>
+        <w:t xml:space="preserve">	</w:t>
+      </w:r>
+      <w:r>
+        <w:t xml:space="preserve">A. Gut,</w:t>
+      </w:r>
+      <w:r>
+        <w:t xml:space="preserve"> </w:t>
+      </w:r>
+      <w:r>
+        <w:rPr>
+          <w:i/>
+          <w:iCs/>
+        </w:rPr>
+        <w:t xml:space="preserve">Probability: A graduate course</w:t>
+      </w:r>
+      <w:r>
+        <w:t xml:space="preserve">, 2nd ed. in Springer texts in statistics. New York: Springer, 2013. doi:</w:t>
+      </w:r>
+      <w:r>
+        <w:t xml:space="preserve"> </w:t>
+      </w:r>
+      <w:hyperlink r:id="rId45">
+        <w:r>
+          <w:rPr>
+            <w:rStyle w:val="Hyperlink"/>
+          </w:rPr>
+          <w:t xml:space="preserve">10.1007/978-1-4614-4708-5</w:t>
+        </w:r>
+      </w:hyperlink>
+      <w:r>
+        <w:t xml:space="preserve">.</w:t>
+      </w:r>
+    </w:p>
+    <w:bookmarkEnd w:id="46"/>
+    <w:bookmarkStart w:id="47" w:name="ref-billingsley1995probability"/>
+    <w:p>
+      <w:pPr>
+        <w:pStyle w:val="Bibliography"/>
+      </w:pPr>
+      <w:r>
+        <w:t xml:space="preserve">[5]</w:t>
+      </w:r>
+      <w:r>
+        <w:t xml:space="preserve"> </w:t>
+      </w:r>
+      <w:r>
+        <w:t xml:space="preserve">	</w:t>
+      </w:r>
+      <w:r>
+        <w:t xml:space="preserve">P. Billingsley,</w:t>
+      </w:r>
+      <w:r>
+        <w:t xml:space="preserve"> </w:t>
+      </w:r>
+      <w:r>
+        <w:rPr>
+          <w:i/>
+          <w:iCs/>
+        </w:rPr>
+        <w:t xml:space="preserve">Probability and measure</w:t>
+      </w:r>
+      <w:r>
+        <w:t xml:space="preserve">, 3rd ed. in Wiley series in probability and mathematical statistics. New York: Wiley, 1995.</w:t>
+      </w:r>
+    </w:p>
+    <w:bookmarkEnd w:id="47"/>
+    <w:bookmarkStart w:id="49" w:name="ref-problifesaver"/>
+    <w:p>
+      <w:pPr>
+        <w:pStyle w:val="Bibliography"/>
+      </w:pPr>
+      <w:r>
+        <w:t xml:space="preserve">[6]</w:t>
       </w:r>
       <w:r>
         <w:t xml:space="preserve"> </w:t>
@@ -1321,7 +1484,7 @@
       <w:r>
         <w:t xml:space="preserve"> </w:t>
       </w:r>
-      <w:hyperlink r:id="rId43">
+      <w:hyperlink r:id="rId48">
         <w:r>
           <w:rPr>
             <w:rStyle w:val="Hyperlink"/>
@@ -1333,14 +1496,14 @@
         <w:t xml:space="preserve">.</w:t>
       </w:r>
     </w:p>
-    <w:bookmarkEnd w:id="44"/>
-    <w:bookmarkStart w:id="46" w:name="ref-hastie2009elements"/>
+    <w:bookmarkEnd w:id="49"/>
+    <w:bookmarkStart w:id="51" w:name="ref-hastie2009elements"/>
     <w:p>
       <w:pPr>
         <w:pStyle w:val="Bibliography"/>
       </w:pPr>
       <w:r>
-        <w:t xml:space="preserve">[4]</w:t>
+        <w:t xml:space="preserve">[7]</w:t>
       </w:r>
       <w:r>
         <w:t xml:space="preserve"> </w:t>
@@ -1367,7 +1530,7 @@
       <w:r>
         <w:t xml:space="preserve"> </w:t>
       </w:r>
-      <w:hyperlink r:id="rId45">
+      <w:hyperlink r:id="rId50">
         <w:r>
           <w:rPr>
             <w:rStyle w:val="Hyperlink"/>
@@ -1379,14 +1542,14 @@
         <w:t xml:space="preserve">.</w:t>
       </w:r>
     </w:p>
-    <w:bookmarkEnd w:id="46"/>
-    <w:bookmarkStart w:id="48" w:name="ref-james2021islr2e"/>
+    <w:bookmarkEnd w:id="51"/>
+    <w:bookmarkStart w:id="53" w:name="ref-james2021islr2e"/>
     <w:p>
       <w:pPr>
         <w:pStyle w:val="Bibliography"/>
       </w:pPr>
       <w:r>
-        <w:t xml:space="preserve">[5]</w:t>
+        <w:t xml:space="preserve">[8]</w:t>
       </w:r>
       <w:r>
         <w:t xml:space="preserve"> </w:t>
@@ -1427,7 +1590,7 @@
       <w:r>
         <w:t xml:space="preserve"> </w:t>
       </w:r>
-      <w:hyperlink r:id="rId47">
+      <w:hyperlink r:id="rId52">
         <w:r>
           <w:rPr>
             <w:rStyle w:val="Hyperlink"/>
@@ -1439,14 +1602,14 @@
         <w:t xml:space="preserve">.</w:t>
       </w:r>
     </w:p>
-    <w:bookmarkEnd w:id="48"/>
-    <w:bookmarkStart w:id="49" w:name="ref-dembo-notes"/>
+    <w:bookmarkEnd w:id="53"/>
+    <w:bookmarkStart w:id="54" w:name="ref-dembo-notes"/>
     <w:p>
       <w:pPr>
         <w:pStyle w:val="Bibliography"/>
       </w:pPr>
       <w:r>
-        <w:t xml:space="preserve">[6]</w:t>
+        <w:t xml:space="preserve">[9]</w:t>
       </w:r>
       <w:r>
         <w:t xml:space="preserve"> </w:t>
@@ -1481,9 +1644,9 @@
         </w:r>
       </w:hyperlink>
     </w:p>
-    <w:bookmarkEnd w:id="49"/>
-    <w:bookmarkEnd w:id="50"/>
-    <w:bookmarkEnd w:id="51"/>
+    <w:bookmarkEnd w:id="54"/>
+    <w:bookmarkEnd w:id="55"/>
+    <w:bookmarkEnd w:id="56"/>
     <w:sectPr>
       <w:footnotePr>
         <w:numRestart w:val="eachSect"/>

</xml_diff>